<commit_message>
menambahakan file kuis formatif
</commit_message>
<xml_diff>
--- a/Kuis Formatif Pertemuan 7.docx
+++ b/Kuis Formatif Pertemuan 7.docx
@@ -3,1244 +3,2265 @@
 <w:document xmlns:wpc="http://schemas.microsoft.com/office/word/2010/wordprocessingCanvas" xmlns:cx="http://schemas.microsoft.com/office/drawing/2014/chartex" xmlns:cx1="http://schemas.microsoft.com/office/drawing/2015/9/8/chartex" xmlns:cx2="http://schemas.microsoft.com/office/drawing/2015/10/21/chartex" xmlns:cx3="http://schemas.microsoft.com/office/drawing/2016/5/9/chartex" xmlns:cx4="http://schemas.microsoft.com/office/drawing/2016/5/10/chartex" xmlns:cx5="http://schemas.microsoft.com/office/drawing/2016/5/11/chartex" xmlns:cx6="http://schemas.microsoft.com/office/drawing/2016/5/12/chartex" xmlns:cx7="http://schemas.microsoft.com/office/drawing/2016/5/13/chartex" xmlns:cx8="http://schemas.microsoft.com/office/drawing/2016/5/14/chartex" xmlns:mc="http://schemas.openxmlformats.org/markup-compatibility/2006" xmlns:aink="http://schemas.microsoft.com/office/drawing/2016/ink" xmlns:am3d="http://schemas.microsoft.com/office/drawing/2017/model3d" xmlns:o="urn:schemas-microsoft-com:office:office" xmlns:r="http://schemas.openxmlformats.org/officeDocument/2006/relationships" xmlns:m="http://schemas.openxmlformats.org/officeDocument/2006/math" xmlns:v="urn:schemas-microsoft-com:vml" xmlns:wp14="http://schemas.microsoft.com/office/word/2010/wordprocessingDrawing" xmlns:wp="http://schemas.openxmlformats.org/drawingml/2006/wordprocessingDrawing" xmlns:w10="urn:schemas-microsoft-com:office:word" xmlns:w="http://schemas.openxmlformats.org/wordprocessingml/2006/main" xmlns:w14="http://schemas.microsoft.com/office/word/2010/wordml" xmlns:w15="http://schemas.microsoft.com/office/word/2012/wordml" xmlns:w16cex="http://schemas.microsoft.com/office/word/2018/wordml/cex" xmlns:w16cid="http://schemas.microsoft.com/office/word/2016/wordml/cid" xmlns:w16="http://schemas.microsoft.com/office/word/2018/wordml" xmlns:w16sdtdh="http://schemas.microsoft.com/office/word/2020/wordml/sdtdatahash" xmlns:w16se="http://schemas.microsoft.com/office/word/2015/wordml/symex" xmlns:wpg="http://schemas.microsoft.com/office/word/2010/wordprocessingGroup" xmlns:wpi="http://schemas.microsoft.com/office/word/2010/wordprocessingInk" xmlns:wne="http://schemas.microsoft.com/office/word/2006/wordml" xmlns:wps="http://schemas.microsoft.com/office/word/2010/wordprocessingShape" mc:Ignorable="w14 w15 w16se w16cid w16 w16cex w16sdtdh wp14">
   <w:body>
     <w:p>
-      <w:r>
+      <w:pPr>
+        <w:rPr>
+          <w:rFonts w:ascii="Times New Roman" w:hAnsi="Times New Roman" w:cs="Times New Roman"/>
+        </w:rPr>
+      </w:pPr>
+      <w:r>
+        <w:rPr>
+          <w:rFonts w:ascii="Times New Roman" w:hAnsi="Times New Roman" w:cs="Times New Roman"/>
+        </w:rPr>
         <w:t>Nama: Intan Anugra Salsabila</w:t>
       </w:r>
     </w:p>
     <w:p>
-      <w:r>
+      <w:pPr>
+        <w:rPr>
+          <w:rFonts w:ascii="Times New Roman" w:hAnsi="Times New Roman" w:cs="Times New Roman"/>
+        </w:rPr>
+      </w:pPr>
+      <w:r>
+        <w:rPr>
+          <w:rFonts w:ascii="Times New Roman" w:hAnsi="Times New Roman" w:cs="Times New Roman"/>
+        </w:rPr>
         <w:t>Nim: 2225250154</w:t>
       </w:r>
     </w:p>
     <w:p>
-      <w:r>
+      <w:pPr>
+        <w:rPr>
+          <w:rFonts w:ascii="Times New Roman" w:hAnsi="Times New Roman" w:cs="Times New Roman"/>
+        </w:rPr>
+      </w:pPr>
+      <w:r>
+        <w:rPr>
+          <w:rFonts w:ascii="Times New Roman" w:hAnsi="Times New Roman" w:cs="Times New Roman"/>
+        </w:rPr>
         <w:t>Kelas: 3F</w:t>
       </w:r>
     </w:p>
     <w:p>
-      <w:r>
+      <w:pPr>
+        <w:rPr>
+          <w:rFonts w:ascii="Times New Roman" w:hAnsi="Times New Roman" w:cs="Times New Roman"/>
+        </w:rPr>
+      </w:pPr>
+      <w:r>
+        <w:rPr>
+          <w:rFonts w:ascii="Times New Roman" w:hAnsi="Times New Roman" w:cs="Times New Roman"/>
+        </w:rPr>
         <w:t xml:space="preserve">1. </w:t>
       </w:r>
       <w:proofErr w:type="spellStart"/>
       <w:r>
+        <w:rPr>
+          <w:rFonts w:ascii="Times New Roman" w:hAnsi="Times New Roman" w:cs="Times New Roman"/>
+        </w:rPr>
         <w:t>Apa</w:t>
       </w:r>
       <w:proofErr w:type="spellEnd"/>
       <w:r>
-        <w:t xml:space="preserve"> </w:t>
-      </w:r>
-      <w:proofErr w:type="spellStart"/>
-      <w:r>
+        <w:rPr>
+          <w:rFonts w:ascii="Times New Roman" w:hAnsi="Times New Roman" w:cs="Times New Roman"/>
+        </w:rPr>
+        <w:t xml:space="preserve"> </w:t>
+      </w:r>
+      <w:proofErr w:type="spellStart"/>
+      <w:r>
+        <w:rPr>
+          <w:rFonts w:ascii="Times New Roman" w:hAnsi="Times New Roman" w:cs="Times New Roman"/>
+        </w:rPr>
         <w:t>fungsi</w:t>
       </w:r>
       <w:proofErr w:type="spellEnd"/>
       <w:r>
+        <w:rPr>
+          <w:rFonts w:ascii="Times New Roman" w:hAnsi="Times New Roman" w:cs="Times New Roman"/>
+        </w:rPr>
         <w:t xml:space="preserve"> kata </w:t>
       </w:r>
       <w:proofErr w:type="spellStart"/>
       <w:r>
+        <w:rPr>
+          <w:rFonts w:ascii="Times New Roman" w:hAnsi="Times New Roman" w:cs="Times New Roman"/>
+        </w:rPr>
         <w:t>kunci</w:t>
       </w:r>
       <w:proofErr w:type="spellEnd"/>
       <w:r>
+        <w:rPr>
+          <w:rFonts w:ascii="Times New Roman" w:hAnsi="Times New Roman" w:cs="Times New Roman"/>
+        </w:rPr>
         <w:t xml:space="preserve"> def </w:t>
       </w:r>
       <w:proofErr w:type="spellStart"/>
       <w:r>
+        <w:rPr>
+          <w:rFonts w:ascii="Times New Roman" w:hAnsi="Times New Roman" w:cs="Times New Roman"/>
+        </w:rPr>
         <w:t>dalam</w:t>
       </w:r>
       <w:proofErr w:type="spellEnd"/>
       <w:r>
+        <w:rPr>
+          <w:rFonts w:ascii="Times New Roman" w:hAnsi="Times New Roman" w:cs="Times New Roman"/>
+        </w:rPr>
         <w:t xml:space="preserve"> Python?</w:t>
       </w:r>
     </w:p>
     <w:p>
-      <w:proofErr w:type="spellStart"/>
-      <w:r>
+      <w:pPr>
+        <w:rPr>
+          <w:rFonts w:ascii="Times New Roman" w:hAnsi="Times New Roman" w:cs="Times New Roman"/>
+        </w:rPr>
+      </w:pPr>
+      <w:proofErr w:type="spellStart"/>
+      <w:r>
+        <w:rPr>
+          <w:rFonts w:ascii="Times New Roman" w:hAnsi="Times New Roman" w:cs="Times New Roman"/>
+        </w:rPr>
         <w:t>Jawaban</w:t>
       </w:r>
       <w:proofErr w:type="spellEnd"/>
       <w:r>
+        <w:rPr>
+          <w:rFonts w:ascii="Times New Roman" w:hAnsi="Times New Roman" w:cs="Times New Roman"/>
+        </w:rPr>
         <w:t xml:space="preserve">: </w:t>
       </w:r>
       <w:proofErr w:type="spellStart"/>
       <w:r>
+        <w:rPr>
+          <w:rFonts w:ascii="Times New Roman" w:hAnsi="Times New Roman" w:cs="Times New Roman"/>
+        </w:rPr>
         <w:t>Untuk</w:t>
       </w:r>
       <w:proofErr w:type="spellEnd"/>
       <w:r>
-        <w:t xml:space="preserve"> </w:t>
-      </w:r>
-      <w:proofErr w:type="spellStart"/>
-      <w:r>
+        <w:rPr>
+          <w:rFonts w:ascii="Times New Roman" w:hAnsi="Times New Roman" w:cs="Times New Roman"/>
+        </w:rPr>
+        <w:t xml:space="preserve"> </w:t>
+      </w:r>
+      <w:proofErr w:type="spellStart"/>
+      <w:r>
+        <w:rPr>
+          <w:rFonts w:ascii="Times New Roman" w:hAnsi="Times New Roman" w:cs="Times New Roman"/>
+        </w:rPr>
         <w:t>membuat</w:t>
       </w:r>
       <w:proofErr w:type="spellEnd"/>
       <w:r>
-        <w:t xml:space="preserve"> </w:t>
-      </w:r>
-      <w:proofErr w:type="spellStart"/>
-      <w:r>
+        <w:rPr>
+          <w:rFonts w:ascii="Times New Roman" w:hAnsi="Times New Roman" w:cs="Times New Roman"/>
+        </w:rPr>
+        <w:t xml:space="preserve"> </w:t>
+      </w:r>
+      <w:proofErr w:type="spellStart"/>
+      <w:r>
+        <w:rPr>
+          <w:rFonts w:ascii="Times New Roman" w:hAnsi="Times New Roman" w:cs="Times New Roman"/>
+        </w:rPr>
         <w:t>atau</w:t>
       </w:r>
       <w:proofErr w:type="spellEnd"/>
       <w:r>
-        <w:t xml:space="preserve"> </w:t>
-      </w:r>
-      <w:proofErr w:type="spellStart"/>
-      <w:r>
+        <w:rPr>
+          <w:rFonts w:ascii="Times New Roman" w:hAnsi="Times New Roman" w:cs="Times New Roman"/>
+        </w:rPr>
+        <w:t xml:space="preserve"> </w:t>
+      </w:r>
+      <w:proofErr w:type="spellStart"/>
+      <w:r>
+        <w:rPr>
+          <w:rFonts w:ascii="Times New Roman" w:hAnsi="Times New Roman" w:cs="Times New Roman"/>
+        </w:rPr>
         <w:t>mendefinisikan</w:t>
       </w:r>
       <w:proofErr w:type="spellEnd"/>
       <w:r>
-        <w:t xml:space="preserve"> </w:t>
-      </w:r>
-      <w:proofErr w:type="spellStart"/>
-      <w:r>
+        <w:rPr>
+          <w:rFonts w:ascii="Times New Roman" w:hAnsi="Times New Roman" w:cs="Times New Roman"/>
+        </w:rPr>
+        <w:t xml:space="preserve"> </w:t>
+      </w:r>
+      <w:proofErr w:type="spellStart"/>
+      <w:r>
+        <w:rPr>
+          <w:rFonts w:ascii="Times New Roman" w:hAnsi="Times New Roman" w:cs="Times New Roman"/>
+        </w:rPr>
         <w:t>fungsi</w:t>
       </w:r>
       <w:proofErr w:type="spellEnd"/>
       <w:r>
-        <w:t xml:space="preserve"> </w:t>
-      </w:r>
-      <w:proofErr w:type="spellStart"/>
-      <w:r>
+        <w:rPr>
+          <w:rFonts w:ascii="Times New Roman" w:hAnsi="Times New Roman" w:cs="Times New Roman"/>
+        </w:rPr>
+        <w:t xml:space="preserve"> </w:t>
+      </w:r>
+      <w:proofErr w:type="spellStart"/>
+      <w:r>
+        <w:rPr>
+          <w:rFonts w:ascii="Times New Roman" w:hAnsi="Times New Roman" w:cs="Times New Roman"/>
+        </w:rPr>
         <w:t>baru</w:t>
       </w:r>
       <w:proofErr w:type="spellEnd"/>
       <w:r>
+        <w:rPr>
+          <w:rFonts w:ascii="Times New Roman" w:hAnsi="Times New Roman" w:cs="Times New Roman"/>
+        </w:rPr>
         <w:t>.</w:t>
       </w:r>
     </w:p>
     <w:p>
-      <w:r>
+      <w:pPr>
+        <w:rPr>
+          <w:rFonts w:ascii="Times New Roman" w:hAnsi="Times New Roman" w:cs="Times New Roman"/>
+        </w:rPr>
+      </w:pPr>
+      <w:r>
+        <w:rPr>
+          <w:rFonts w:ascii="Times New Roman" w:hAnsi="Times New Roman" w:cs="Times New Roman"/>
+        </w:rPr>
         <w:t xml:space="preserve">2. </w:t>
       </w:r>
       <w:proofErr w:type="spellStart"/>
       <w:r>
+        <w:rPr>
+          <w:rFonts w:ascii="Times New Roman" w:hAnsi="Times New Roman" w:cs="Times New Roman"/>
+        </w:rPr>
         <w:t>Apa</w:t>
       </w:r>
       <w:proofErr w:type="spellEnd"/>
       <w:r>
-        <w:t xml:space="preserve"> </w:t>
-      </w:r>
-      <w:proofErr w:type="spellStart"/>
-      <w:r>
+        <w:rPr>
+          <w:rFonts w:ascii="Times New Roman" w:hAnsi="Times New Roman" w:cs="Times New Roman"/>
+        </w:rPr>
+        <w:t xml:space="preserve"> </w:t>
+      </w:r>
+      <w:proofErr w:type="spellStart"/>
+      <w:r>
+        <w:rPr>
+          <w:rFonts w:ascii="Times New Roman" w:hAnsi="Times New Roman" w:cs="Times New Roman"/>
+        </w:rPr>
         <w:t>perbedaan</w:t>
       </w:r>
       <w:proofErr w:type="spellEnd"/>
       <w:r>
+        <w:rPr>
+          <w:rFonts w:ascii="Times New Roman" w:hAnsi="Times New Roman" w:cs="Times New Roman"/>
+        </w:rPr>
         <w:t xml:space="preserve"> parameter dan </w:t>
       </w:r>
       <w:proofErr w:type="spellStart"/>
       <w:r>
+        <w:rPr>
+          <w:rFonts w:ascii="Times New Roman" w:hAnsi="Times New Roman" w:cs="Times New Roman"/>
+        </w:rPr>
         <w:t>argumen</w:t>
       </w:r>
       <w:proofErr w:type="spellEnd"/>
       <w:r>
+        <w:rPr>
+          <w:rFonts w:ascii="Times New Roman" w:hAnsi="Times New Roman" w:cs="Times New Roman"/>
+        </w:rPr>
         <w:t>?</w:t>
       </w:r>
     </w:p>
     <w:p>
-      <w:proofErr w:type="spellStart"/>
-      <w:r>
+      <w:pPr>
+        <w:rPr>
+          <w:rFonts w:ascii="Times New Roman" w:hAnsi="Times New Roman" w:cs="Times New Roman"/>
+        </w:rPr>
+      </w:pPr>
+      <w:proofErr w:type="spellStart"/>
+      <w:r>
+        <w:rPr>
+          <w:rFonts w:ascii="Times New Roman" w:hAnsi="Times New Roman" w:cs="Times New Roman"/>
+        </w:rPr>
         <w:t>Jawaban</w:t>
       </w:r>
       <w:proofErr w:type="spellEnd"/>
       <w:r>
+        <w:rPr>
+          <w:rFonts w:ascii="Times New Roman" w:hAnsi="Times New Roman" w:cs="Times New Roman"/>
+        </w:rPr>
         <w:t xml:space="preserve">: Parameter </w:t>
       </w:r>
       <w:proofErr w:type="spellStart"/>
       <w:r>
+        <w:rPr>
+          <w:rFonts w:ascii="Times New Roman" w:hAnsi="Times New Roman" w:cs="Times New Roman"/>
+        </w:rPr>
         <w:t>adalah</w:t>
       </w:r>
       <w:proofErr w:type="spellEnd"/>
       <w:r>
-        <w:t xml:space="preserve"> </w:t>
-      </w:r>
-      <w:proofErr w:type="spellStart"/>
-      <w:r>
+        <w:rPr>
+          <w:rFonts w:ascii="Times New Roman" w:hAnsi="Times New Roman" w:cs="Times New Roman"/>
+        </w:rPr>
+        <w:t xml:space="preserve"> </w:t>
+      </w:r>
+      <w:proofErr w:type="spellStart"/>
+      <w:r>
+        <w:rPr>
+          <w:rFonts w:ascii="Times New Roman" w:hAnsi="Times New Roman" w:cs="Times New Roman"/>
+        </w:rPr>
         <w:t>variabel</w:t>
       </w:r>
       <w:proofErr w:type="spellEnd"/>
       <w:r>
-        <w:t xml:space="preserve"> </w:t>
-      </w:r>
-      <w:proofErr w:type="spellStart"/>
-      <w:r>
+        <w:rPr>
+          <w:rFonts w:ascii="Times New Roman" w:hAnsi="Times New Roman" w:cs="Times New Roman"/>
+        </w:rPr>
+        <w:t xml:space="preserve"> </w:t>
+      </w:r>
+      <w:proofErr w:type="spellStart"/>
+      <w:r>
+        <w:rPr>
+          <w:rFonts w:ascii="Times New Roman" w:hAnsi="Times New Roman" w:cs="Times New Roman"/>
+        </w:rPr>
         <w:t>saat</w:t>
       </w:r>
       <w:proofErr w:type="spellEnd"/>
       <w:r>
-        <w:t xml:space="preserve"> </w:t>
-      </w:r>
-      <w:proofErr w:type="spellStart"/>
-      <w:r>
+        <w:rPr>
+          <w:rFonts w:ascii="Times New Roman" w:hAnsi="Times New Roman" w:cs="Times New Roman"/>
+        </w:rPr>
+        <w:t xml:space="preserve"> </w:t>
+      </w:r>
+      <w:proofErr w:type="spellStart"/>
+      <w:r>
+        <w:rPr>
+          <w:rFonts w:ascii="Times New Roman" w:hAnsi="Times New Roman" w:cs="Times New Roman"/>
+        </w:rPr>
         <w:t>fungsi</w:t>
       </w:r>
       <w:proofErr w:type="spellEnd"/>
       <w:r>
-        <w:t xml:space="preserve"> </w:t>
-      </w:r>
-      <w:proofErr w:type="spellStart"/>
-      <w:r>
+        <w:rPr>
+          <w:rFonts w:ascii="Times New Roman" w:hAnsi="Times New Roman" w:cs="Times New Roman"/>
+        </w:rPr>
+        <w:t xml:space="preserve"> </w:t>
+      </w:r>
+      <w:proofErr w:type="spellStart"/>
+      <w:r>
+        <w:rPr>
+          <w:rFonts w:ascii="Times New Roman" w:hAnsi="Times New Roman" w:cs="Times New Roman"/>
+        </w:rPr>
         <w:t>dibuat</w:t>
       </w:r>
       <w:proofErr w:type="spellEnd"/>
       <w:r>
+        <w:rPr>
+          <w:rFonts w:ascii="Times New Roman" w:hAnsi="Times New Roman" w:cs="Times New Roman"/>
+        </w:rPr>
         <w:t xml:space="preserve">, </w:t>
       </w:r>
       <w:proofErr w:type="spellStart"/>
       <w:r>
+        <w:rPr>
+          <w:rFonts w:ascii="Times New Roman" w:hAnsi="Times New Roman" w:cs="Times New Roman"/>
+        </w:rPr>
         <w:t>sedangkan</w:t>
       </w:r>
       <w:proofErr w:type="spellEnd"/>
       <w:r>
-        <w:t xml:space="preserve"> </w:t>
-      </w:r>
-      <w:proofErr w:type="spellStart"/>
-      <w:r>
+        <w:rPr>
+          <w:rFonts w:ascii="Times New Roman" w:hAnsi="Times New Roman" w:cs="Times New Roman"/>
+        </w:rPr>
+        <w:t xml:space="preserve"> </w:t>
+      </w:r>
+      <w:proofErr w:type="spellStart"/>
+      <w:r>
+        <w:rPr>
+          <w:rFonts w:ascii="Times New Roman" w:hAnsi="Times New Roman" w:cs="Times New Roman"/>
+        </w:rPr>
         <w:t>argumen</w:t>
       </w:r>
       <w:proofErr w:type="spellEnd"/>
       <w:r>
-        <w:t xml:space="preserve"> </w:t>
-      </w:r>
-      <w:proofErr w:type="spellStart"/>
-      <w:r>
+        <w:rPr>
+          <w:rFonts w:ascii="Times New Roman" w:hAnsi="Times New Roman" w:cs="Times New Roman"/>
+        </w:rPr>
+        <w:t xml:space="preserve"> </w:t>
+      </w:r>
+      <w:proofErr w:type="spellStart"/>
+      <w:r>
+        <w:rPr>
+          <w:rFonts w:ascii="Times New Roman" w:hAnsi="Times New Roman" w:cs="Times New Roman"/>
+        </w:rPr>
         <w:t>adalah</w:t>
       </w:r>
       <w:proofErr w:type="spellEnd"/>
       <w:r>
-        <w:t xml:space="preserve"> </w:t>
-      </w:r>
-      <w:proofErr w:type="spellStart"/>
-      <w:r>
+        <w:rPr>
+          <w:rFonts w:ascii="Times New Roman" w:hAnsi="Times New Roman" w:cs="Times New Roman"/>
+        </w:rPr>
+        <w:t xml:space="preserve"> </w:t>
+      </w:r>
+      <w:proofErr w:type="spellStart"/>
+      <w:r>
+        <w:rPr>
+          <w:rFonts w:ascii="Times New Roman" w:hAnsi="Times New Roman" w:cs="Times New Roman"/>
+        </w:rPr>
         <w:t>nilai</w:t>
       </w:r>
       <w:proofErr w:type="spellEnd"/>
       <w:r>
-        <w:t xml:space="preserve"> </w:t>
-      </w:r>
-      <w:proofErr w:type="spellStart"/>
-      <w:r>
+        <w:rPr>
+          <w:rFonts w:ascii="Times New Roman" w:hAnsi="Times New Roman" w:cs="Times New Roman"/>
+        </w:rPr>
+        <w:t xml:space="preserve"> </w:t>
+      </w:r>
+      <w:proofErr w:type="spellStart"/>
+      <w:r>
+        <w:rPr>
+          <w:rFonts w:ascii="Times New Roman" w:hAnsi="Times New Roman" w:cs="Times New Roman"/>
+        </w:rPr>
         <w:t>nyata</w:t>
       </w:r>
       <w:proofErr w:type="spellEnd"/>
       <w:r>
-        <w:t xml:space="preserve"> </w:t>
-      </w:r>
-      <w:proofErr w:type="spellStart"/>
-      <w:r>
+        <w:rPr>
+          <w:rFonts w:ascii="Times New Roman" w:hAnsi="Times New Roman" w:cs="Times New Roman"/>
+        </w:rPr>
+        <w:t xml:space="preserve"> </w:t>
+      </w:r>
+      <w:proofErr w:type="spellStart"/>
+      <w:r>
+        <w:rPr>
+          <w:rFonts w:ascii="Times New Roman" w:hAnsi="Times New Roman" w:cs="Times New Roman"/>
+        </w:rPr>
         <w:t>saat</w:t>
       </w:r>
       <w:proofErr w:type="spellEnd"/>
       <w:r>
-        <w:t xml:space="preserve"> </w:t>
-      </w:r>
-      <w:proofErr w:type="spellStart"/>
-      <w:r>
+        <w:rPr>
+          <w:rFonts w:ascii="Times New Roman" w:hAnsi="Times New Roman" w:cs="Times New Roman"/>
+        </w:rPr>
+        <w:t xml:space="preserve"> </w:t>
+      </w:r>
+      <w:proofErr w:type="spellStart"/>
+      <w:r>
+        <w:rPr>
+          <w:rFonts w:ascii="Times New Roman" w:hAnsi="Times New Roman" w:cs="Times New Roman"/>
+        </w:rPr>
         <w:t>fungsi</w:t>
       </w:r>
       <w:proofErr w:type="spellEnd"/>
       <w:r>
-        <w:t xml:space="preserve"> </w:t>
-      </w:r>
-      <w:proofErr w:type="spellStart"/>
-      <w:r>
+        <w:rPr>
+          <w:rFonts w:ascii="Times New Roman" w:hAnsi="Times New Roman" w:cs="Times New Roman"/>
+        </w:rPr>
+        <w:t xml:space="preserve"> </w:t>
+      </w:r>
+      <w:proofErr w:type="spellStart"/>
+      <w:r>
+        <w:rPr>
+          <w:rFonts w:ascii="Times New Roman" w:hAnsi="Times New Roman" w:cs="Times New Roman"/>
+        </w:rPr>
         <w:t>dipanggil</w:t>
       </w:r>
       <w:proofErr w:type="spellEnd"/>
       <w:r>
+        <w:rPr>
+          <w:rFonts w:ascii="Times New Roman" w:hAnsi="Times New Roman" w:cs="Times New Roman"/>
+        </w:rPr>
         <w:t>.</w:t>
       </w:r>
     </w:p>
     <w:p>
-      <w:r>
+      <w:pPr>
+        <w:rPr>
+          <w:rFonts w:ascii="Times New Roman" w:hAnsi="Times New Roman" w:cs="Times New Roman"/>
+        </w:rPr>
+      </w:pPr>
+      <w:r>
+        <w:rPr>
+          <w:rFonts w:ascii="Times New Roman" w:hAnsi="Times New Roman" w:cs="Times New Roman"/>
+        </w:rPr>
         <w:t xml:space="preserve">3. Kapan return </w:t>
       </w:r>
       <w:proofErr w:type="spellStart"/>
       <w:r>
+        <w:rPr>
+          <w:rFonts w:ascii="Times New Roman" w:hAnsi="Times New Roman" w:cs="Times New Roman"/>
+        </w:rPr>
         <w:t>lebih</w:t>
       </w:r>
       <w:proofErr w:type="spellEnd"/>
       <w:r>
-        <w:t xml:space="preserve"> </w:t>
-      </w:r>
-      <w:proofErr w:type="spellStart"/>
-      <w:r>
+        <w:rPr>
+          <w:rFonts w:ascii="Times New Roman" w:hAnsi="Times New Roman" w:cs="Times New Roman"/>
+        </w:rPr>
+        <w:t xml:space="preserve"> </w:t>
+      </w:r>
+      <w:proofErr w:type="spellStart"/>
+      <w:r>
+        <w:rPr>
+          <w:rFonts w:ascii="Times New Roman" w:hAnsi="Times New Roman" w:cs="Times New Roman"/>
+        </w:rPr>
         <w:t>tepat</w:t>
       </w:r>
       <w:proofErr w:type="spellEnd"/>
       <w:r>
-        <w:t xml:space="preserve"> </w:t>
-      </w:r>
-      <w:proofErr w:type="spellStart"/>
-      <w:r>
+        <w:rPr>
+          <w:rFonts w:ascii="Times New Roman" w:hAnsi="Times New Roman" w:cs="Times New Roman"/>
+        </w:rPr>
+        <w:t xml:space="preserve"> </w:t>
+      </w:r>
+      <w:proofErr w:type="spellStart"/>
+      <w:r>
+        <w:rPr>
+          <w:rFonts w:ascii="Times New Roman" w:hAnsi="Times New Roman" w:cs="Times New Roman"/>
+        </w:rPr>
         <w:t>daripada</w:t>
       </w:r>
       <w:proofErr w:type="spellEnd"/>
       <w:r>
+        <w:rPr>
+          <w:rFonts w:ascii="Times New Roman" w:hAnsi="Times New Roman" w:cs="Times New Roman"/>
+        </w:rPr>
         <w:t xml:space="preserve"> print?</w:t>
       </w:r>
     </w:p>
     <w:p>
-      <w:proofErr w:type="spellStart"/>
-      <w:r>
+      <w:pPr>
+        <w:rPr>
+          <w:rFonts w:ascii="Times New Roman" w:hAnsi="Times New Roman" w:cs="Times New Roman"/>
+        </w:rPr>
+      </w:pPr>
+      <w:proofErr w:type="spellStart"/>
+      <w:r>
+        <w:rPr>
+          <w:rFonts w:ascii="Times New Roman" w:hAnsi="Times New Roman" w:cs="Times New Roman"/>
+        </w:rPr>
         <w:t>Jawaban</w:t>
       </w:r>
       <w:proofErr w:type="spellEnd"/>
       <w:r>
+        <w:rPr>
+          <w:rFonts w:ascii="Times New Roman" w:hAnsi="Times New Roman" w:cs="Times New Roman"/>
+        </w:rPr>
         <w:t xml:space="preserve">: Saat </w:t>
       </w:r>
       <w:proofErr w:type="spellStart"/>
       <w:r>
+        <w:rPr>
+          <w:rFonts w:ascii="Times New Roman" w:hAnsi="Times New Roman" w:cs="Times New Roman"/>
+        </w:rPr>
         <w:t>hasil</w:t>
       </w:r>
       <w:proofErr w:type="spellEnd"/>
       <w:r>
-        <w:t xml:space="preserve"> </w:t>
-      </w:r>
-      <w:proofErr w:type="spellStart"/>
-      <w:r>
+        <w:rPr>
+          <w:rFonts w:ascii="Times New Roman" w:hAnsi="Times New Roman" w:cs="Times New Roman"/>
+        </w:rPr>
+        <w:t xml:space="preserve"> </w:t>
+      </w:r>
+      <w:proofErr w:type="spellStart"/>
+      <w:r>
+        <w:rPr>
+          <w:rFonts w:ascii="Times New Roman" w:hAnsi="Times New Roman" w:cs="Times New Roman"/>
+        </w:rPr>
         <w:t>fungsi</w:t>
       </w:r>
       <w:proofErr w:type="spellEnd"/>
       <w:r>
-        <w:t xml:space="preserve"> </w:t>
-      </w:r>
-      <w:proofErr w:type="spellStart"/>
-      <w:r>
+        <w:rPr>
+          <w:rFonts w:ascii="Times New Roman" w:hAnsi="Times New Roman" w:cs="Times New Roman"/>
+        </w:rPr>
+        <w:t xml:space="preserve"> </w:t>
+      </w:r>
+      <w:proofErr w:type="spellStart"/>
+      <w:r>
+        <w:rPr>
+          <w:rFonts w:ascii="Times New Roman" w:hAnsi="Times New Roman" w:cs="Times New Roman"/>
+        </w:rPr>
         <w:t>perlu</w:t>
       </w:r>
       <w:proofErr w:type="spellEnd"/>
       <w:r>
-        <w:t xml:space="preserve"> </w:t>
-      </w:r>
-      <w:proofErr w:type="spellStart"/>
-      <w:r>
+        <w:rPr>
+          <w:rFonts w:ascii="Times New Roman" w:hAnsi="Times New Roman" w:cs="Times New Roman"/>
+        </w:rPr>
+        <w:t xml:space="preserve"> </w:t>
+      </w:r>
+      <w:proofErr w:type="spellStart"/>
+      <w:r>
+        <w:rPr>
+          <w:rFonts w:ascii="Times New Roman" w:hAnsi="Times New Roman" w:cs="Times New Roman"/>
+        </w:rPr>
         <w:t>disimpan</w:t>
       </w:r>
       <w:proofErr w:type="spellEnd"/>
       <w:r>
-        <w:t xml:space="preserve"> </w:t>
-      </w:r>
-      <w:proofErr w:type="spellStart"/>
-      <w:r>
+        <w:rPr>
+          <w:rFonts w:ascii="Times New Roman" w:hAnsi="Times New Roman" w:cs="Times New Roman"/>
+        </w:rPr>
+        <w:t xml:space="preserve"> </w:t>
+      </w:r>
+      <w:proofErr w:type="spellStart"/>
+      <w:r>
+        <w:rPr>
+          <w:rFonts w:ascii="Times New Roman" w:hAnsi="Times New Roman" w:cs="Times New Roman"/>
+        </w:rPr>
         <w:t>atau</w:t>
       </w:r>
       <w:proofErr w:type="spellEnd"/>
       <w:r>
-        <w:t xml:space="preserve"> </w:t>
-      </w:r>
-      <w:proofErr w:type="spellStart"/>
-      <w:r>
+        <w:rPr>
+          <w:rFonts w:ascii="Times New Roman" w:hAnsi="Times New Roman" w:cs="Times New Roman"/>
+        </w:rPr>
+        <w:t xml:space="preserve"> </w:t>
+      </w:r>
+      <w:proofErr w:type="spellStart"/>
+      <w:r>
+        <w:rPr>
+          <w:rFonts w:ascii="Times New Roman" w:hAnsi="Times New Roman" w:cs="Times New Roman"/>
+        </w:rPr>
         <w:t>digunakan</w:t>
       </w:r>
       <w:proofErr w:type="spellEnd"/>
       <w:r>
-        <w:t xml:space="preserve"> </w:t>
-      </w:r>
-      <w:proofErr w:type="spellStart"/>
-      <w:r>
+        <w:rPr>
+          <w:rFonts w:ascii="Times New Roman" w:hAnsi="Times New Roman" w:cs="Times New Roman"/>
+        </w:rPr>
+        <w:t xml:space="preserve"> </w:t>
+      </w:r>
+      <w:proofErr w:type="spellStart"/>
+      <w:r>
+        <w:rPr>
+          <w:rFonts w:ascii="Times New Roman" w:hAnsi="Times New Roman" w:cs="Times New Roman"/>
+        </w:rPr>
         <w:t>lagi</w:t>
       </w:r>
       <w:proofErr w:type="spellEnd"/>
       <w:r>
-        <w:t xml:space="preserve"> </w:t>
-      </w:r>
-      <w:proofErr w:type="spellStart"/>
-      <w:r>
+        <w:rPr>
+          <w:rFonts w:ascii="Times New Roman" w:hAnsi="Times New Roman" w:cs="Times New Roman"/>
+        </w:rPr>
+        <w:t xml:space="preserve"> </w:t>
+      </w:r>
+      <w:proofErr w:type="spellStart"/>
+      <w:r>
+        <w:rPr>
+          <w:rFonts w:ascii="Times New Roman" w:hAnsi="Times New Roman" w:cs="Times New Roman"/>
+        </w:rPr>
         <w:t>untuk</w:t>
       </w:r>
       <w:proofErr w:type="spellEnd"/>
       <w:r>
-        <w:t xml:space="preserve"> </w:t>
-      </w:r>
-      <w:proofErr w:type="spellStart"/>
-      <w:r>
+        <w:rPr>
+          <w:rFonts w:ascii="Times New Roman" w:hAnsi="Times New Roman" w:cs="Times New Roman"/>
+        </w:rPr>
+        <w:t xml:space="preserve"> </w:t>
+      </w:r>
+      <w:proofErr w:type="spellStart"/>
+      <w:r>
+        <w:rPr>
+          <w:rFonts w:ascii="Times New Roman" w:hAnsi="Times New Roman" w:cs="Times New Roman"/>
+        </w:rPr>
         <w:t>perhitungan</w:t>
       </w:r>
       <w:proofErr w:type="spellEnd"/>
       <w:r>
+        <w:rPr>
+          <w:rFonts w:ascii="Times New Roman" w:hAnsi="Times New Roman" w:cs="Times New Roman"/>
+        </w:rPr>
         <w:t xml:space="preserve"> lain di </w:t>
       </w:r>
       <w:proofErr w:type="spellStart"/>
       <w:r>
+        <w:rPr>
+          <w:rFonts w:ascii="Times New Roman" w:hAnsi="Times New Roman" w:cs="Times New Roman"/>
+        </w:rPr>
         <w:t>luar</w:t>
       </w:r>
       <w:proofErr w:type="spellEnd"/>
       <w:r>
-        <w:t xml:space="preserve"> </w:t>
-      </w:r>
-      <w:proofErr w:type="spellStart"/>
-      <w:r>
+        <w:rPr>
+          <w:rFonts w:ascii="Times New Roman" w:hAnsi="Times New Roman" w:cs="Times New Roman"/>
+        </w:rPr>
+        <w:t xml:space="preserve"> </w:t>
+      </w:r>
+      <w:proofErr w:type="spellStart"/>
+      <w:r>
+        <w:rPr>
+          <w:rFonts w:ascii="Times New Roman" w:hAnsi="Times New Roman" w:cs="Times New Roman"/>
+        </w:rPr>
         <w:t>fungsi</w:t>
       </w:r>
       <w:proofErr w:type="spellEnd"/>
       <w:r>
+        <w:rPr>
+          <w:rFonts w:ascii="Times New Roman" w:hAnsi="Times New Roman" w:cs="Times New Roman"/>
+        </w:rPr>
         <w:t>.</w:t>
       </w:r>
     </w:p>
     <w:p>
-      <w:r>
+      <w:pPr>
+        <w:rPr>
+          <w:rFonts w:ascii="Times New Roman" w:hAnsi="Times New Roman" w:cs="Times New Roman"/>
+        </w:rPr>
+      </w:pPr>
+      <w:r>
+        <w:rPr>
+          <w:rFonts w:ascii="Times New Roman" w:hAnsi="Times New Roman" w:cs="Times New Roman"/>
+        </w:rPr>
         <w:t xml:space="preserve">4. </w:t>
       </w:r>
       <w:proofErr w:type="spellStart"/>
       <w:r>
+        <w:rPr>
+          <w:rFonts w:ascii="Times New Roman" w:hAnsi="Times New Roman" w:cs="Times New Roman"/>
+        </w:rPr>
         <w:t>Apa</w:t>
       </w:r>
       <w:proofErr w:type="spellEnd"/>
       <w:r>
-        <w:t xml:space="preserve"> </w:t>
-      </w:r>
-      <w:proofErr w:type="spellStart"/>
-      <w:r>
+        <w:rPr>
+          <w:rFonts w:ascii="Times New Roman" w:hAnsi="Times New Roman" w:cs="Times New Roman"/>
+        </w:rPr>
+        <w:t xml:space="preserve"> </w:t>
+      </w:r>
+      <w:proofErr w:type="spellStart"/>
+      <w:r>
+        <w:rPr>
+          <w:rFonts w:ascii="Times New Roman" w:hAnsi="Times New Roman" w:cs="Times New Roman"/>
+        </w:rPr>
         <w:t>nilai</w:t>
       </w:r>
       <w:proofErr w:type="spellEnd"/>
       <w:r>
-        <w:t xml:space="preserve"> </w:t>
-      </w:r>
-      <w:proofErr w:type="spellStart"/>
-      <w:r>
+        <w:rPr>
+          <w:rFonts w:ascii="Times New Roman" w:hAnsi="Times New Roman" w:cs="Times New Roman"/>
+        </w:rPr>
+        <w:t xml:space="preserve"> </w:t>
+      </w:r>
+      <w:proofErr w:type="spellStart"/>
+      <w:r>
+        <w:rPr>
+          <w:rFonts w:ascii="Times New Roman" w:hAnsi="Times New Roman" w:cs="Times New Roman"/>
+        </w:rPr>
         <w:t>variabel</w:t>
       </w:r>
       <w:proofErr w:type="spellEnd"/>
       <w:r>
+        <w:rPr>
+          <w:rFonts w:ascii="Times New Roman" w:hAnsi="Times New Roman" w:cs="Times New Roman"/>
+        </w:rPr>
         <w:t xml:space="preserve"> x pada </w:t>
       </w:r>
       <w:proofErr w:type="spellStart"/>
       <w:r>
+        <w:rPr>
+          <w:rFonts w:ascii="Times New Roman" w:hAnsi="Times New Roman" w:cs="Times New Roman"/>
+        </w:rPr>
         <w:t>kode</w:t>
       </w:r>
       <w:proofErr w:type="spellEnd"/>
       <w:r>
+        <w:rPr>
+          <w:rFonts w:ascii="Times New Roman" w:hAnsi="Times New Roman" w:cs="Times New Roman"/>
+        </w:rPr>
         <w:t xml:space="preserve"> x = </w:t>
       </w:r>
       <w:proofErr w:type="spellStart"/>
       <w:proofErr w:type="gramStart"/>
       <w:r>
+        <w:rPr>
+          <w:rFonts w:ascii="Times New Roman" w:hAnsi="Times New Roman" w:cs="Times New Roman"/>
+        </w:rPr>
         <w:t>kuadrat</w:t>
       </w:r>
       <w:proofErr w:type="spellEnd"/>
       <w:r>
+        <w:rPr>
+          <w:rFonts w:ascii="Times New Roman" w:hAnsi="Times New Roman" w:cs="Times New Roman"/>
+        </w:rPr>
         <w:t>(</w:t>
       </w:r>
       <w:proofErr w:type="gramEnd"/>
       <w:r>
+        <w:rPr>
+          <w:rFonts w:ascii="Times New Roman" w:hAnsi="Times New Roman" w:cs="Times New Roman"/>
+        </w:rPr>
         <w:t xml:space="preserve">4) </w:t>
       </w:r>
       <w:proofErr w:type="spellStart"/>
       <w:r>
+        <w:rPr>
+          <w:rFonts w:ascii="Times New Roman" w:hAnsi="Times New Roman" w:cs="Times New Roman"/>
+        </w:rPr>
         <w:t>jika</w:t>
       </w:r>
       <w:proofErr w:type="spellEnd"/>
       <w:r>
-        <w:t xml:space="preserve"> </w:t>
-      </w:r>
-      <w:proofErr w:type="spellStart"/>
-      <w:r>
+        <w:rPr>
+          <w:rFonts w:ascii="Times New Roman" w:hAnsi="Times New Roman" w:cs="Times New Roman"/>
+        </w:rPr>
+        <w:t xml:space="preserve"> </w:t>
+      </w:r>
+      <w:proofErr w:type="spellStart"/>
+      <w:r>
+        <w:rPr>
+          <w:rFonts w:ascii="Times New Roman" w:hAnsi="Times New Roman" w:cs="Times New Roman"/>
+        </w:rPr>
         <w:t>kuadrat</w:t>
       </w:r>
       <w:proofErr w:type="spellEnd"/>
       <w:r>
-        <w:t xml:space="preserve"> </w:t>
-      </w:r>
-      <w:proofErr w:type="spellStart"/>
-      <w:r>
+        <w:rPr>
+          <w:rFonts w:ascii="Times New Roman" w:hAnsi="Times New Roman" w:cs="Times New Roman"/>
+        </w:rPr>
+        <w:t xml:space="preserve"> </w:t>
+      </w:r>
+      <w:proofErr w:type="spellStart"/>
+      <w:r>
+        <w:rPr>
+          <w:rFonts w:ascii="Times New Roman" w:hAnsi="Times New Roman" w:cs="Times New Roman"/>
+        </w:rPr>
         <w:t>mengembalikan</w:t>
       </w:r>
       <w:proofErr w:type="spellEnd"/>
       <w:r>
+        <w:rPr>
+          <w:rFonts w:ascii="Times New Roman" w:hAnsi="Times New Roman" w:cs="Times New Roman"/>
+        </w:rPr>
         <w:t xml:space="preserve"> x*x?</w:t>
       </w:r>
     </w:p>
     <w:p>
-      <w:proofErr w:type="spellStart"/>
-      <w:r>
+      <w:pPr>
+        <w:rPr>
+          <w:rFonts w:ascii="Times New Roman" w:hAnsi="Times New Roman" w:cs="Times New Roman"/>
+        </w:rPr>
+      </w:pPr>
+      <w:proofErr w:type="spellStart"/>
+      <w:r>
+        <w:rPr>
+          <w:rFonts w:ascii="Times New Roman" w:hAnsi="Times New Roman" w:cs="Times New Roman"/>
+        </w:rPr>
         <w:t>Jawaban</w:t>
       </w:r>
       <w:proofErr w:type="spellEnd"/>
       <w:r>
+        <w:rPr>
+          <w:rFonts w:ascii="Times New Roman" w:hAnsi="Times New Roman" w:cs="Times New Roman"/>
+        </w:rPr>
         <w:t>: 16.</w:t>
       </w:r>
     </w:p>
     <w:p>
-      <w:r>
+      <w:pPr>
+        <w:rPr>
+          <w:rFonts w:ascii="Times New Roman" w:hAnsi="Times New Roman" w:cs="Times New Roman"/>
+        </w:rPr>
+      </w:pPr>
+      <w:r>
+        <w:rPr>
+          <w:rFonts w:ascii="Times New Roman" w:hAnsi="Times New Roman" w:cs="Times New Roman"/>
+        </w:rPr>
         <w:t xml:space="preserve">5. </w:t>
       </w:r>
       <w:proofErr w:type="spellStart"/>
       <w:r>
+        <w:rPr>
+          <w:rFonts w:ascii="Times New Roman" w:hAnsi="Times New Roman" w:cs="Times New Roman"/>
+        </w:rPr>
         <w:t>Mengapa</w:t>
       </w:r>
       <w:proofErr w:type="spellEnd"/>
       <w:r>
-        <w:t xml:space="preserve"> </w:t>
-      </w:r>
-      <w:proofErr w:type="spellStart"/>
-      <w:r>
+        <w:rPr>
+          <w:rFonts w:ascii="Times New Roman" w:hAnsi="Times New Roman" w:cs="Times New Roman"/>
+        </w:rPr>
+        <w:t xml:space="preserve"> </w:t>
+      </w:r>
+      <w:proofErr w:type="spellStart"/>
+      <w:r>
+        <w:rPr>
+          <w:rFonts w:ascii="Times New Roman" w:hAnsi="Times New Roman" w:cs="Times New Roman"/>
+        </w:rPr>
         <w:t>variabel</w:t>
       </w:r>
       <w:proofErr w:type="spellEnd"/>
       <w:r>
-        <w:t xml:space="preserve"> </w:t>
-      </w:r>
-      <w:proofErr w:type="spellStart"/>
-      <w:r>
+        <w:rPr>
+          <w:rFonts w:ascii="Times New Roman" w:hAnsi="Times New Roman" w:cs="Times New Roman"/>
+        </w:rPr>
+        <w:t xml:space="preserve"> </w:t>
+      </w:r>
+      <w:proofErr w:type="spellStart"/>
+      <w:r>
+        <w:rPr>
+          <w:rFonts w:ascii="Times New Roman" w:hAnsi="Times New Roman" w:cs="Times New Roman"/>
+        </w:rPr>
         <w:t>lokal</w:t>
       </w:r>
       <w:proofErr w:type="spellEnd"/>
       <w:r>
-        <w:t xml:space="preserve"> </w:t>
-      </w:r>
-      <w:proofErr w:type="spellStart"/>
-      <w:r>
+        <w:rPr>
+          <w:rFonts w:ascii="Times New Roman" w:hAnsi="Times New Roman" w:cs="Times New Roman"/>
+        </w:rPr>
+        <w:t xml:space="preserve"> </w:t>
+      </w:r>
+      <w:proofErr w:type="spellStart"/>
+      <w:r>
+        <w:rPr>
+          <w:rFonts w:ascii="Times New Roman" w:hAnsi="Times New Roman" w:cs="Times New Roman"/>
+        </w:rPr>
         <w:t>sebaiknya</w:t>
       </w:r>
       <w:proofErr w:type="spellEnd"/>
       <w:r>
-        <w:t xml:space="preserve"> </w:t>
-      </w:r>
-      <w:proofErr w:type="spellStart"/>
-      <w:r>
+        <w:rPr>
+          <w:rFonts w:ascii="Times New Roman" w:hAnsi="Times New Roman" w:cs="Times New Roman"/>
+        </w:rPr>
+        <w:t xml:space="preserve"> </w:t>
+      </w:r>
+      <w:proofErr w:type="spellStart"/>
+      <w:r>
+        <w:rPr>
+          <w:rFonts w:ascii="Times New Roman" w:hAnsi="Times New Roman" w:cs="Times New Roman"/>
+        </w:rPr>
         <w:t>tidak</w:t>
       </w:r>
       <w:proofErr w:type="spellEnd"/>
       <w:r>
-        <w:t xml:space="preserve"> </w:t>
-      </w:r>
-      <w:proofErr w:type="spellStart"/>
-      <w:r>
+        <w:rPr>
+          <w:rFonts w:ascii="Times New Roman" w:hAnsi="Times New Roman" w:cs="Times New Roman"/>
+        </w:rPr>
+        <w:t xml:space="preserve"> </w:t>
+      </w:r>
+      <w:proofErr w:type="spellStart"/>
+      <w:r>
+        <w:rPr>
+          <w:rFonts w:ascii="Times New Roman" w:hAnsi="Times New Roman" w:cs="Times New Roman"/>
+        </w:rPr>
         <w:t>bergantung</w:t>
       </w:r>
       <w:proofErr w:type="spellEnd"/>
       <w:r>
+        <w:rPr>
+          <w:rFonts w:ascii="Times New Roman" w:hAnsi="Times New Roman" w:cs="Times New Roman"/>
+        </w:rPr>
         <w:t xml:space="preserve"> pada </w:t>
       </w:r>
       <w:proofErr w:type="spellStart"/>
       <w:r>
+        <w:rPr>
+          <w:rFonts w:ascii="Times New Roman" w:hAnsi="Times New Roman" w:cs="Times New Roman"/>
+        </w:rPr>
         <w:t>perubahan</w:t>
       </w:r>
       <w:proofErr w:type="spellEnd"/>
       <w:r>
-        <w:t xml:space="preserve"> </w:t>
-      </w:r>
-      <w:proofErr w:type="spellStart"/>
-      <w:r>
+        <w:rPr>
+          <w:rFonts w:ascii="Times New Roman" w:hAnsi="Times New Roman" w:cs="Times New Roman"/>
+        </w:rPr>
+        <w:t xml:space="preserve"> </w:t>
+      </w:r>
+      <w:proofErr w:type="spellStart"/>
+      <w:r>
+        <w:rPr>
+          <w:rFonts w:ascii="Times New Roman" w:hAnsi="Times New Roman" w:cs="Times New Roman"/>
+        </w:rPr>
         <w:t>dari</w:t>
       </w:r>
       <w:proofErr w:type="spellEnd"/>
       <w:r>
-        <w:t xml:space="preserve"> </w:t>
-      </w:r>
-      <w:proofErr w:type="spellStart"/>
-      <w:r>
+        <w:rPr>
+          <w:rFonts w:ascii="Times New Roman" w:hAnsi="Times New Roman" w:cs="Times New Roman"/>
+        </w:rPr>
+        <w:t xml:space="preserve"> </w:t>
+      </w:r>
+      <w:proofErr w:type="spellStart"/>
+      <w:r>
+        <w:rPr>
+          <w:rFonts w:ascii="Times New Roman" w:hAnsi="Times New Roman" w:cs="Times New Roman"/>
+        </w:rPr>
         <w:t>luar</w:t>
       </w:r>
       <w:proofErr w:type="spellEnd"/>
       <w:r>
-        <w:t xml:space="preserve"> </w:t>
-      </w:r>
-      <w:proofErr w:type="spellStart"/>
-      <w:r>
+        <w:rPr>
+          <w:rFonts w:ascii="Times New Roman" w:hAnsi="Times New Roman" w:cs="Times New Roman"/>
+        </w:rPr>
+        <w:t xml:space="preserve"> </w:t>
+      </w:r>
+      <w:proofErr w:type="spellStart"/>
+      <w:r>
+        <w:rPr>
+          <w:rFonts w:ascii="Times New Roman" w:hAnsi="Times New Roman" w:cs="Times New Roman"/>
+        </w:rPr>
         <w:t>fungsi</w:t>
       </w:r>
       <w:proofErr w:type="spellEnd"/>
       <w:r>
+        <w:rPr>
+          <w:rFonts w:ascii="Times New Roman" w:hAnsi="Times New Roman" w:cs="Times New Roman"/>
+        </w:rPr>
         <w:t>?</w:t>
       </w:r>
     </w:p>
     <w:p>
-      <w:proofErr w:type="spellStart"/>
-      <w:r>
+      <w:pPr>
+        <w:rPr>
+          <w:rFonts w:ascii="Times New Roman" w:hAnsi="Times New Roman" w:cs="Times New Roman"/>
+        </w:rPr>
+      </w:pPr>
+      <w:proofErr w:type="spellStart"/>
+      <w:r>
+        <w:rPr>
+          <w:rFonts w:ascii="Times New Roman" w:hAnsi="Times New Roman" w:cs="Times New Roman"/>
+        </w:rPr>
         <w:t>Jawaban</w:t>
       </w:r>
       <w:proofErr w:type="spellEnd"/>
       <w:r>
+        <w:rPr>
+          <w:rFonts w:ascii="Times New Roman" w:hAnsi="Times New Roman" w:cs="Times New Roman"/>
+        </w:rPr>
         <w:t xml:space="preserve">: Agar </w:t>
       </w:r>
       <w:proofErr w:type="spellStart"/>
       <w:r>
+        <w:rPr>
+          <w:rFonts w:ascii="Times New Roman" w:hAnsi="Times New Roman" w:cs="Times New Roman"/>
+        </w:rPr>
         <w:t>fungsi</w:t>
       </w:r>
       <w:proofErr w:type="spellEnd"/>
       <w:r>
-        <w:t xml:space="preserve"> </w:t>
-      </w:r>
-      <w:proofErr w:type="spellStart"/>
-      <w:r>
+        <w:rPr>
+          <w:rFonts w:ascii="Times New Roman" w:hAnsi="Times New Roman" w:cs="Times New Roman"/>
+        </w:rPr>
+        <w:t xml:space="preserve"> </w:t>
+      </w:r>
+      <w:proofErr w:type="spellStart"/>
+      <w:r>
+        <w:rPr>
+          <w:rFonts w:ascii="Times New Roman" w:hAnsi="Times New Roman" w:cs="Times New Roman"/>
+        </w:rPr>
         <w:t>bersifat</w:t>
       </w:r>
       <w:proofErr w:type="spellEnd"/>
       <w:r>
-        <w:t xml:space="preserve"> </w:t>
-      </w:r>
-      <w:proofErr w:type="spellStart"/>
-      <w:r>
+        <w:rPr>
+          <w:rFonts w:ascii="Times New Roman" w:hAnsi="Times New Roman" w:cs="Times New Roman"/>
+        </w:rPr>
+        <w:t xml:space="preserve"> </w:t>
+      </w:r>
+      <w:proofErr w:type="spellStart"/>
+      <w:r>
+        <w:rPr>
+          <w:rFonts w:ascii="Times New Roman" w:hAnsi="Times New Roman" w:cs="Times New Roman"/>
+        </w:rPr>
         <w:t>mandiri</w:t>
       </w:r>
       <w:proofErr w:type="spellEnd"/>
       <w:r>
+        <w:rPr>
+          <w:rFonts w:ascii="Times New Roman" w:hAnsi="Times New Roman" w:cs="Times New Roman"/>
+        </w:rPr>
         <w:t xml:space="preserve">, </w:t>
       </w:r>
       <w:proofErr w:type="spellStart"/>
       <w:r>
+        <w:rPr>
+          <w:rFonts w:ascii="Times New Roman" w:hAnsi="Times New Roman" w:cs="Times New Roman"/>
+        </w:rPr>
         <w:t>tidak</w:t>
       </w:r>
       <w:proofErr w:type="spellEnd"/>
       <w:r>
-        <w:t xml:space="preserve"> </w:t>
-      </w:r>
-      <w:proofErr w:type="spellStart"/>
-      <w:r>
+        <w:rPr>
+          <w:rFonts w:ascii="Times New Roman" w:hAnsi="Times New Roman" w:cs="Times New Roman"/>
+        </w:rPr>
+        <w:t xml:space="preserve"> </w:t>
+      </w:r>
+      <w:proofErr w:type="spellStart"/>
+      <w:r>
+        <w:rPr>
+          <w:rFonts w:ascii="Times New Roman" w:hAnsi="Times New Roman" w:cs="Times New Roman"/>
+        </w:rPr>
         <w:t>mudah</w:t>
       </w:r>
       <w:proofErr w:type="spellEnd"/>
       <w:r>
+        <w:rPr>
+          <w:rFonts w:ascii="Times New Roman" w:hAnsi="Times New Roman" w:cs="Times New Roman"/>
+        </w:rPr>
         <w:t xml:space="preserve"> error, dan </w:t>
       </w:r>
       <w:proofErr w:type="spellStart"/>
       <w:r>
+        <w:rPr>
+          <w:rFonts w:ascii="Times New Roman" w:hAnsi="Times New Roman" w:cs="Times New Roman"/>
+        </w:rPr>
         <w:t>bisa</w:t>
       </w:r>
       <w:proofErr w:type="spellEnd"/>
       <w:r>
-        <w:t xml:space="preserve"> </w:t>
-      </w:r>
-      <w:proofErr w:type="spellStart"/>
-      <w:r>
+        <w:rPr>
+          <w:rFonts w:ascii="Times New Roman" w:hAnsi="Times New Roman" w:cs="Times New Roman"/>
+        </w:rPr>
+        <w:t xml:space="preserve"> </w:t>
+      </w:r>
+      <w:proofErr w:type="spellStart"/>
+      <w:r>
+        <w:rPr>
+          <w:rFonts w:ascii="Times New Roman" w:hAnsi="Times New Roman" w:cs="Times New Roman"/>
+        </w:rPr>
         <w:t>digunakan</w:t>
       </w:r>
       <w:proofErr w:type="spellEnd"/>
       <w:r>
-        <w:t xml:space="preserve"> </w:t>
-      </w:r>
-      <w:proofErr w:type="spellStart"/>
-      <w:r>
+        <w:rPr>
+          <w:rFonts w:ascii="Times New Roman" w:hAnsi="Times New Roman" w:cs="Times New Roman"/>
+        </w:rPr>
+        <w:t xml:space="preserve"> </w:t>
+      </w:r>
+      <w:proofErr w:type="spellStart"/>
+      <w:r>
+        <w:rPr>
+          <w:rFonts w:ascii="Times New Roman" w:hAnsi="Times New Roman" w:cs="Times New Roman"/>
+        </w:rPr>
         <w:t>kembali</w:t>
       </w:r>
       <w:proofErr w:type="spellEnd"/>
       <w:r>
+        <w:rPr>
+          <w:rFonts w:ascii="Times New Roman" w:hAnsi="Times New Roman" w:cs="Times New Roman"/>
+        </w:rPr>
         <w:t>.</w:t>
       </w:r>
     </w:p>
     <w:p>
-      <w:r>
+      <w:pPr>
+        <w:rPr>
+          <w:rFonts w:ascii="Times New Roman" w:hAnsi="Times New Roman" w:cs="Times New Roman"/>
+        </w:rPr>
+      </w:pPr>
+      <w:r>
+        <w:rPr>
+          <w:rFonts w:ascii="Times New Roman" w:hAnsi="Times New Roman" w:cs="Times New Roman"/>
+        </w:rPr>
         <w:t xml:space="preserve">6. </w:t>
       </w:r>
       <w:proofErr w:type="spellStart"/>
       <w:r>
+        <w:rPr>
+          <w:rFonts w:ascii="Times New Roman" w:hAnsi="Times New Roman" w:cs="Times New Roman"/>
+        </w:rPr>
         <w:t>Apa</w:t>
       </w:r>
       <w:proofErr w:type="spellEnd"/>
       <w:r>
+        <w:rPr>
+          <w:rFonts w:ascii="Times New Roman" w:hAnsi="Times New Roman" w:cs="Times New Roman"/>
+        </w:rPr>
         <w:t xml:space="preserve"> yang </w:t>
       </w:r>
       <w:proofErr w:type="spellStart"/>
       <w:r>
+        <w:rPr>
+          <w:rFonts w:ascii="Times New Roman" w:hAnsi="Times New Roman" w:cs="Times New Roman"/>
+        </w:rPr>
         <w:t>terjadi</w:t>
       </w:r>
       <w:proofErr w:type="spellEnd"/>
       <w:r>
-        <w:t xml:space="preserve"> </w:t>
-      </w:r>
-      <w:proofErr w:type="spellStart"/>
-      <w:r>
+        <w:rPr>
+          <w:rFonts w:ascii="Times New Roman" w:hAnsi="Times New Roman" w:cs="Times New Roman"/>
+        </w:rPr>
+        <w:t xml:space="preserve"> </w:t>
+      </w:r>
+      <w:proofErr w:type="spellStart"/>
+      <w:r>
+        <w:rPr>
+          <w:rFonts w:ascii="Times New Roman" w:hAnsi="Times New Roman" w:cs="Times New Roman"/>
+        </w:rPr>
         <w:t>jika</w:t>
       </w:r>
       <w:proofErr w:type="spellEnd"/>
       <w:r>
-        <w:t xml:space="preserve"> </w:t>
-      </w:r>
-      <w:proofErr w:type="spellStart"/>
-      <w:r>
+        <w:rPr>
+          <w:rFonts w:ascii="Times New Roman" w:hAnsi="Times New Roman" w:cs="Times New Roman"/>
+        </w:rPr>
+        <w:t xml:space="preserve"> </w:t>
+      </w:r>
+      <w:proofErr w:type="spellStart"/>
+      <w:r>
+        <w:rPr>
+          <w:rFonts w:ascii="Times New Roman" w:hAnsi="Times New Roman" w:cs="Times New Roman"/>
+        </w:rPr>
         <w:t>fungsi</w:t>
       </w:r>
       <w:proofErr w:type="spellEnd"/>
       <w:r>
-        <w:t xml:space="preserve"> </w:t>
-      </w:r>
-      <w:proofErr w:type="spellStart"/>
-      <w:r>
+        <w:rPr>
+          <w:rFonts w:ascii="Times New Roman" w:hAnsi="Times New Roman" w:cs="Times New Roman"/>
+        </w:rPr>
+        <w:t xml:space="preserve"> </w:t>
+      </w:r>
+      <w:proofErr w:type="spellStart"/>
+      <w:r>
+        <w:rPr>
+          <w:rFonts w:ascii="Times New Roman" w:hAnsi="Times New Roman" w:cs="Times New Roman"/>
+        </w:rPr>
         <w:t>memerlukan</w:t>
       </w:r>
       <w:proofErr w:type="spellEnd"/>
       <w:r>
-        <w:t xml:space="preserve"> </w:t>
-      </w:r>
-      <w:proofErr w:type="spellStart"/>
-      <w:r>
+        <w:rPr>
+          <w:rFonts w:ascii="Times New Roman" w:hAnsi="Times New Roman" w:cs="Times New Roman"/>
+        </w:rPr>
+        <w:t xml:space="preserve"> </w:t>
+      </w:r>
+      <w:proofErr w:type="spellStart"/>
+      <w:r>
+        <w:rPr>
+          <w:rFonts w:ascii="Times New Roman" w:hAnsi="Times New Roman" w:cs="Times New Roman"/>
+        </w:rPr>
         <w:t>dua</w:t>
       </w:r>
       <w:proofErr w:type="spellEnd"/>
       <w:r>
+        <w:rPr>
+          <w:rFonts w:ascii="Times New Roman" w:hAnsi="Times New Roman" w:cs="Times New Roman"/>
+        </w:rPr>
         <w:t xml:space="preserve"> parameter </w:t>
       </w:r>
       <w:proofErr w:type="spellStart"/>
       <w:r>
+        <w:rPr>
+          <w:rFonts w:ascii="Times New Roman" w:hAnsi="Times New Roman" w:cs="Times New Roman"/>
+        </w:rPr>
         <w:t>tetapi</w:t>
       </w:r>
       <w:proofErr w:type="spellEnd"/>
       <w:r>
-        <w:t xml:space="preserve"> </w:t>
-      </w:r>
-      <w:proofErr w:type="spellStart"/>
-      <w:r>
+        <w:rPr>
+          <w:rFonts w:ascii="Times New Roman" w:hAnsi="Times New Roman" w:cs="Times New Roman"/>
+        </w:rPr>
+        <w:t xml:space="preserve"> </w:t>
+      </w:r>
+      <w:proofErr w:type="spellStart"/>
+      <w:r>
+        <w:rPr>
+          <w:rFonts w:ascii="Times New Roman" w:hAnsi="Times New Roman" w:cs="Times New Roman"/>
+        </w:rPr>
         <w:t>hanya</w:t>
       </w:r>
       <w:proofErr w:type="spellEnd"/>
       <w:r>
-        <w:t xml:space="preserve"> </w:t>
-      </w:r>
-      <w:proofErr w:type="spellStart"/>
-      <w:r>
+        <w:rPr>
+          <w:rFonts w:ascii="Times New Roman" w:hAnsi="Times New Roman" w:cs="Times New Roman"/>
+        </w:rPr>
+        <w:t xml:space="preserve"> </w:t>
+      </w:r>
+      <w:proofErr w:type="spellStart"/>
+      <w:r>
+        <w:rPr>
+          <w:rFonts w:ascii="Times New Roman" w:hAnsi="Times New Roman" w:cs="Times New Roman"/>
+        </w:rPr>
         <w:t>diberi</w:t>
       </w:r>
       <w:proofErr w:type="spellEnd"/>
       <w:r>
-        <w:t xml:space="preserve"> </w:t>
-      </w:r>
-      <w:proofErr w:type="spellStart"/>
-      <w:r>
+        <w:rPr>
+          <w:rFonts w:ascii="Times New Roman" w:hAnsi="Times New Roman" w:cs="Times New Roman"/>
+        </w:rPr>
+        <w:t xml:space="preserve"> </w:t>
+      </w:r>
+      <w:proofErr w:type="spellStart"/>
+      <w:r>
+        <w:rPr>
+          <w:rFonts w:ascii="Times New Roman" w:hAnsi="Times New Roman" w:cs="Times New Roman"/>
+        </w:rPr>
         <w:t>satu</w:t>
       </w:r>
       <w:proofErr w:type="spellEnd"/>
       <w:r>
-        <w:t xml:space="preserve"> </w:t>
-      </w:r>
-      <w:proofErr w:type="spellStart"/>
-      <w:r>
+        <w:rPr>
+          <w:rFonts w:ascii="Times New Roman" w:hAnsi="Times New Roman" w:cs="Times New Roman"/>
+        </w:rPr>
+        <w:t xml:space="preserve"> </w:t>
+      </w:r>
+      <w:proofErr w:type="spellStart"/>
+      <w:r>
+        <w:rPr>
+          <w:rFonts w:ascii="Times New Roman" w:hAnsi="Times New Roman" w:cs="Times New Roman"/>
+        </w:rPr>
         <w:t>argumen</w:t>
       </w:r>
       <w:proofErr w:type="spellEnd"/>
       <w:r>
+        <w:rPr>
+          <w:rFonts w:ascii="Times New Roman" w:hAnsi="Times New Roman" w:cs="Times New Roman"/>
+        </w:rPr>
         <w:t>?</w:t>
       </w:r>
     </w:p>
     <w:p>
-      <w:proofErr w:type="spellStart"/>
-      <w:r>
+      <w:pPr>
+        <w:rPr>
+          <w:rFonts w:ascii="Times New Roman" w:hAnsi="Times New Roman" w:cs="Times New Roman"/>
+        </w:rPr>
+      </w:pPr>
+      <w:proofErr w:type="spellStart"/>
+      <w:r>
+        <w:rPr>
+          <w:rFonts w:ascii="Times New Roman" w:hAnsi="Times New Roman" w:cs="Times New Roman"/>
+        </w:rPr>
         <w:t>Jawaban</w:t>
       </w:r>
       <w:proofErr w:type="spellEnd"/>
       <w:r>
+        <w:rPr>
+          <w:rFonts w:ascii="Times New Roman" w:hAnsi="Times New Roman" w:cs="Times New Roman"/>
+        </w:rPr>
         <w:t xml:space="preserve">: </w:t>
       </w:r>
       <w:proofErr w:type="spellStart"/>
       <w:r>
+        <w:rPr>
+          <w:rFonts w:ascii="Times New Roman" w:hAnsi="Times New Roman" w:cs="Times New Roman"/>
+        </w:rPr>
         <w:t>Terjadi</w:t>
       </w:r>
       <w:proofErr w:type="spellEnd"/>
       <w:r>
+        <w:rPr>
+          <w:rFonts w:ascii="Times New Roman" w:hAnsi="Times New Roman" w:cs="Times New Roman"/>
+        </w:rPr>
         <w:t xml:space="preserve"> error </w:t>
       </w:r>
       <w:proofErr w:type="spellStart"/>
       <w:r>
+        <w:rPr>
+          <w:rFonts w:ascii="Times New Roman" w:hAnsi="Times New Roman" w:cs="Times New Roman"/>
+        </w:rPr>
         <w:t>TypeError</w:t>
       </w:r>
       <w:proofErr w:type="spellEnd"/>
       <w:r>
+        <w:rPr>
+          <w:rFonts w:ascii="Times New Roman" w:hAnsi="Times New Roman" w:cs="Times New Roman"/>
+        </w:rPr>
         <w:t>.</w:t>
       </w:r>
     </w:p>
     <w:p>
-      <w:r>
+      <w:pPr>
+        <w:rPr>
+          <w:rFonts w:ascii="Times New Roman" w:hAnsi="Times New Roman" w:cs="Times New Roman"/>
+        </w:rPr>
+      </w:pPr>
+      <w:r>
+        <w:rPr>
+          <w:rFonts w:ascii="Times New Roman" w:hAnsi="Times New Roman" w:cs="Times New Roman"/>
+        </w:rPr>
         <w:t xml:space="preserve">7. </w:t>
       </w:r>
       <w:proofErr w:type="spellStart"/>
       <w:r>
+        <w:rPr>
+          <w:rFonts w:ascii="Times New Roman" w:hAnsi="Times New Roman" w:cs="Times New Roman"/>
+        </w:rPr>
         <w:t>Bagaimana</w:t>
       </w:r>
       <w:proofErr w:type="spellEnd"/>
       <w:r>
-        <w:t xml:space="preserve"> </w:t>
-      </w:r>
-      <w:proofErr w:type="spellStart"/>
-      <w:r>
+        <w:rPr>
+          <w:rFonts w:ascii="Times New Roman" w:hAnsi="Times New Roman" w:cs="Times New Roman"/>
+        </w:rPr>
+        <w:t xml:space="preserve"> </w:t>
+      </w:r>
+      <w:proofErr w:type="spellStart"/>
+      <w:r>
+        <w:rPr>
+          <w:rFonts w:ascii="Times New Roman" w:hAnsi="Times New Roman" w:cs="Times New Roman"/>
+        </w:rPr>
         <w:t>cara</w:t>
       </w:r>
       <w:proofErr w:type="spellEnd"/>
       <w:r>
-        <w:t xml:space="preserve"> </w:t>
-      </w:r>
-      <w:proofErr w:type="spellStart"/>
-      <w:r>
+        <w:rPr>
+          <w:rFonts w:ascii="Times New Roman" w:hAnsi="Times New Roman" w:cs="Times New Roman"/>
+        </w:rPr>
+        <w:t xml:space="preserve"> </w:t>
+      </w:r>
+      <w:proofErr w:type="spellStart"/>
+      <w:r>
+        <w:rPr>
+          <w:rFonts w:ascii="Times New Roman" w:hAnsi="Times New Roman" w:cs="Times New Roman"/>
+        </w:rPr>
         <w:t>memakai</w:t>
       </w:r>
       <w:proofErr w:type="spellEnd"/>
       <w:r>
-        <w:t xml:space="preserve"> </w:t>
-      </w:r>
-      <w:proofErr w:type="spellStart"/>
-      <w:r>
+        <w:rPr>
+          <w:rFonts w:ascii="Times New Roman" w:hAnsi="Times New Roman" w:cs="Times New Roman"/>
+        </w:rPr>
+        <w:t xml:space="preserve"> </w:t>
+      </w:r>
+      <w:proofErr w:type="spellStart"/>
+      <w:r>
+        <w:rPr>
+          <w:rFonts w:ascii="Times New Roman" w:hAnsi="Times New Roman" w:cs="Times New Roman"/>
+        </w:rPr>
         <w:t>nilai</w:t>
       </w:r>
       <w:proofErr w:type="spellEnd"/>
       <w:r>
+        <w:rPr>
+          <w:rFonts w:ascii="Times New Roman" w:hAnsi="Times New Roman" w:cs="Times New Roman"/>
+        </w:rPr>
         <w:t xml:space="preserve"> return </w:t>
       </w:r>
       <w:proofErr w:type="spellStart"/>
       <w:r>
+        <w:rPr>
+          <w:rFonts w:ascii="Times New Roman" w:hAnsi="Times New Roman" w:cs="Times New Roman"/>
+        </w:rPr>
         <w:t>dalam</w:t>
       </w:r>
       <w:proofErr w:type="spellEnd"/>
       <w:r>
-        <w:t xml:space="preserve"> </w:t>
-      </w:r>
-      <w:proofErr w:type="spellStart"/>
-      <w:r>
+        <w:rPr>
+          <w:rFonts w:ascii="Times New Roman" w:hAnsi="Times New Roman" w:cs="Times New Roman"/>
+        </w:rPr>
+        <w:t xml:space="preserve"> </w:t>
+      </w:r>
+      <w:proofErr w:type="spellStart"/>
+      <w:r>
+        <w:rPr>
+          <w:rFonts w:ascii="Times New Roman" w:hAnsi="Times New Roman" w:cs="Times New Roman"/>
+        </w:rPr>
         <w:t>perhitungan</w:t>
       </w:r>
       <w:proofErr w:type="spellEnd"/>
       <w:r>
+        <w:rPr>
+          <w:rFonts w:ascii="Times New Roman" w:hAnsi="Times New Roman" w:cs="Times New Roman"/>
+        </w:rPr>
         <w:t xml:space="preserve"> lain?</w:t>
       </w:r>
     </w:p>
     <w:p>
-      <w:proofErr w:type="spellStart"/>
-      <w:r>
+      <w:pPr>
+        <w:rPr>
+          <w:rFonts w:ascii="Times New Roman" w:hAnsi="Times New Roman" w:cs="Times New Roman"/>
+        </w:rPr>
+      </w:pPr>
+      <w:proofErr w:type="spellStart"/>
+      <w:r>
+        <w:rPr>
+          <w:rFonts w:ascii="Times New Roman" w:hAnsi="Times New Roman" w:cs="Times New Roman"/>
+        </w:rPr>
         <w:t>Jawaban</w:t>
       </w:r>
       <w:proofErr w:type="spellEnd"/>
       <w:r>
+        <w:rPr>
+          <w:rFonts w:ascii="Times New Roman" w:hAnsi="Times New Roman" w:cs="Times New Roman"/>
+        </w:rPr>
         <w:t xml:space="preserve">: </w:t>
       </w:r>
       <w:proofErr w:type="spellStart"/>
       <w:r>
+        <w:rPr>
+          <w:rFonts w:ascii="Times New Roman" w:hAnsi="Times New Roman" w:cs="Times New Roman"/>
+        </w:rPr>
         <w:t>Dimasukkan</w:t>
       </w:r>
       <w:proofErr w:type="spellEnd"/>
       <w:r>
-        <w:t xml:space="preserve"> </w:t>
-      </w:r>
-      <w:proofErr w:type="spellStart"/>
-      <w:r>
+        <w:rPr>
+          <w:rFonts w:ascii="Times New Roman" w:hAnsi="Times New Roman" w:cs="Times New Roman"/>
+        </w:rPr>
+        <w:t xml:space="preserve"> </w:t>
+      </w:r>
+      <w:proofErr w:type="spellStart"/>
+      <w:r>
+        <w:rPr>
+          <w:rFonts w:ascii="Times New Roman" w:hAnsi="Times New Roman" w:cs="Times New Roman"/>
+        </w:rPr>
         <w:t>langsung</w:t>
       </w:r>
       <w:proofErr w:type="spellEnd"/>
       <w:r>
-        <w:t xml:space="preserve"> </w:t>
-      </w:r>
-      <w:proofErr w:type="spellStart"/>
-      <w:r>
+        <w:rPr>
+          <w:rFonts w:ascii="Times New Roman" w:hAnsi="Times New Roman" w:cs="Times New Roman"/>
+        </w:rPr>
+        <w:t xml:space="preserve"> </w:t>
+      </w:r>
+      <w:proofErr w:type="spellStart"/>
+      <w:r>
+        <w:rPr>
+          <w:rFonts w:ascii="Times New Roman" w:hAnsi="Times New Roman" w:cs="Times New Roman"/>
+        </w:rPr>
         <w:t>ke</w:t>
       </w:r>
       <w:proofErr w:type="spellEnd"/>
       <w:r>
-        <w:t xml:space="preserve"> </w:t>
-      </w:r>
-      <w:proofErr w:type="spellStart"/>
-      <w:r>
+        <w:rPr>
+          <w:rFonts w:ascii="Times New Roman" w:hAnsi="Times New Roman" w:cs="Times New Roman"/>
+        </w:rPr>
+        <w:t xml:space="preserve"> </w:t>
+      </w:r>
+      <w:proofErr w:type="spellStart"/>
+      <w:r>
+        <w:rPr>
+          <w:rFonts w:ascii="Times New Roman" w:hAnsi="Times New Roman" w:cs="Times New Roman"/>
+        </w:rPr>
         <w:t>operasi</w:t>
       </w:r>
       <w:proofErr w:type="spellEnd"/>
       <w:r>
-        <w:t xml:space="preserve"> </w:t>
-      </w:r>
-      <w:proofErr w:type="spellStart"/>
-      <w:r>
+        <w:rPr>
+          <w:rFonts w:ascii="Times New Roman" w:hAnsi="Times New Roman" w:cs="Times New Roman"/>
+        </w:rPr>
+        <w:t xml:space="preserve"> </w:t>
+      </w:r>
+      <w:proofErr w:type="spellStart"/>
+      <w:r>
+        <w:rPr>
+          <w:rFonts w:ascii="Times New Roman" w:hAnsi="Times New Roman" w:cs="Times New Roman"/>
+        </w:rPr>
         <w:t>matematika</w:t>
       </w:r>
       <w:proofErr w:type="spellEnd"/>
       <w:r>
-        <w:t xml:space="preserve"> </w:t>
-      </w:r>
-      <w:proofErr w:type="spellStart"/>
-      <w:r>
+        <w:rPr>
+          <w:rFonts w:ascii="Times New Roman" w:hAnsi="Times New Roman" w:cs="Times New Roman"/>
+        </w:rPr>
+        <w:t xml:space="preserve"> </w:t>
+      </w:r>
+      <w:proofErr w:type="spellStart"/>
+      <w:r>
+        <w:rPr>
+          <w:rFonts w:ascii="Times New Roman" w:hAnsi="Times New Roman" w:cs="Times New Roman"/>
+        </w:rPr>
         <w:t>atau</w:t>
       </w:r>
       <w:proofErr w:type="spellEnd"/>
       <w:r>
-        <w:t xml:space="preserve"> </w:t>
-      </w:r>
-      <w:proofErr w:type="spellStart"/>
-      <w:r>
+        <w:rPr>
+          <w:rFonts w:ascii="Times New Roman" w:hAnsi="Times New Roman" w:cs="Times New Roman"/>
+        </w:rPr>
+        <w:t xml:space="preserve"> </w:t>
+      </w:r>
+      <w:proofErr w:type="spellStart"/>
+      <w:r>
+        <w:rPr>
+          <w:rFonts w:ascii="Times New Roman" w:hAnsi="Times New Roman" w:cs="Times New Roman"/>
+        </w:rPr>
         <w:t>disimpan</w:t>
       </w:r>
       <w:proofErr w:type="spellEnd"/>
       <w:r>
-        <w:t xml:space="preserve"> </w:t>
-      </w:r>
-      <w:proofErr w:type="spellStart"/>
-      <w:r>
+        <w:rPr>
+          <w:rFonts w:ascii="Times New Roman" w:hAnsi="Times New Roman" w:cs="Times New Roman"/>
+        </w:rPr>
+        <w:t xml:space="preserve"> </w:t>
+      </w:r>
+      <w:proofErr w:type="spellStart"/>
+      <w:r>
+        <w:rPr>
+          <w:rFonts w:ascii="Times New Roman" w:hAnsi="Times New Roman" w:cs="Times New Roman"/>
+        </w:rPr>
         <w:t>ke</w:t>
       </w:r>
       <w:proofErr w:type="spellEnd"/>
       <w:r>
-        <w:t xml:space="preserve"> </w:t>
-      </w:r>
-      <w:proofErr w:type="spellStart"/>
-      <w:r>
+        <w:rPr>
+          <w:rFonts w:ascii="Times New Roman" w:hAnsi="Times New Roman" w:cs="Times New Roman"/>
+        </w:rPr>
+        <w:t xml:space="preserve"> </w:t>
+      </w:r>
+      <w:proofErr w:type="spellStart"/>
+      <w:r>
+        <w:rPr>
+          <w:rFonts w:ascii="Times New Roman" w:hAnsi="Times New Roman" w:cs="Times New Roman"/>
+        </w:rPr>
         <w:t>dalam</w:t>
       </w:r>
       <w:proofErr w:type="spellEnd"/>
       <w:r>
-        <w:t xml:space="preserve"> </w:t>
-      </w:r>
-      <w:proofErr w:type="spellStart"/>
-      <w:r>
+        <w:rPr>
+          <w:rFonts w:ascii="Times New Roman" w:hAnsi="Times New Roman" w:cs="Times New Roman"/>
+        </w:rPr>
+        <w:t xml:space="preserve"> </w:t>
+      </w:r>
+      <w:proofErr w:type="spellStart"/>
+      <w:r>
+        <w:rPr>
+          <w:rFonts w:ascii="Times New Roman" w:hAnsi="Times New Roman" w:cs="Times New Roman"/>
+        </w:rPr>
         <w:t>variabel</w:t>
       </w:r>
       <w:proofErr w:type="spellEnd"/>
       <w:r>
-        <w:t xml:space="preserve"> </w:t>
-      </w:r>
-      <w:proofErr w:type="spellStart"/>
-      <w:r>
+        <w:rPr>
+          <w:rFonts w:ascii="Times New Roman" w:hAnsi="Times New Roman" w:cs="Times New Roman"/>
+        </w:rPr>
+        <w:t xml:space="preserve"> </w:t>
+      </w:r>
+      <w:proofErr w:type="spellStart"/>
+      <w:r>
+        <w:rPr>
+          <w:rFonts w:ascii="Times New Roman" w:hAnsi="Times New Roman" w:cs="Times New Roman"/>
+        </w:rPr>
         <w:t>baru</w:t>
       </w:r>
       <w:proofErr w:type="spellEnd"/>
       <w:r>
+        <w:rPr>
+          <w:rFonts w:ascii="Times New Roman" w:hAnsi="Times New Roman" w:cs="Times New Roman"/>
+        </w:rPr>
         <w:t>.</w:t>
       </w:r>
     </w:p>
     <w:p>
-      <w:r>
+      <w:pPr>
+        <w:rPr>
+          <w:rFonts w:ascii="Times New Roman" w:hAnsi="Times New Roman" w:cs="Times New Roman"/>
+        </w:rPr>
+      </w:pPr>
+      <w:r>
+        <w:rPr>
+          <w:rFonts w:ascii="Times New Roman" w:hAnsi="Times New Roman" w:cs="Times New Roman"/>
+        </w:rPr>
         <w:t xml:space="preserve">8. </w:t>
       </w:r>
       <w:proofErr w:type="spellStart"/>
       <w:r>
+        <w:rPr>
+          <w:rFonts w:ascii="Times New Roman" w:hAnsi="Times New Roman" w:cs="Times New Roman"/>
+        </w:rPr>
         <w:t>Apa</w:t>
       </w:r>
       <w:proofErr w:type="spellEnd"/>
       <w:r>
-        <w:t xml:space="preserve"> </w:t>
-      </w:r>
-      <w:proofErr w:type="spellStart"/>
-      <w:r>
+        <w:rPr>
+          <w:rFonts w:ascii="Times New Roman" w:hAnsi="Times New Roman" w:cs="Times New Roman"/>
+        </w:rPr>
+        <w:t xml:space="preserve"> </w:t>
+      </w:r>
+      <w:proofErr w:type="spellStart"/>
+      <w:r>
+        <w:rPr>
+          <w:rFonts w:ascii="Times New Roman" w:hAnsi="Times New Roman" w:cs="Times New Roman"/>
+        </w:rPr>
         <w:t>perbedaan</w:t>
       </w:r>
       <w:proofErr w:type="spellEnd"/>
       <w:r>
+        <w:rPr>
+          <w:rFonts w:ascii="Times New Roman" w:hAnsi="Times New Roman" w:cs="Times New Roman"/>
+        </w:rPr>
         <w:t xml:space="preserve"> Step Into dan Step Over </w:t>
       </w:r>
       <w:proofErr w:type="spellStart"/>
       <w:r>
+        <w:rPr>
+          <w:rFonts w:ascii="Times New Roman" w:hAnsi="Times New Roman" w:cs="Times New Roman"/>
+        </w:rPr>
         <w:t>saat</w:t>
       </w:r>
       <w:proofErr w:type="spellEnd"/>
       <w:r>
+        <w:rPr>
+          <w:rFonts w:ascii="Times New Roman" w:hAnsi="Times New Roman" w:cs="Times New Roman"/>
+        </w:rPr>
         <w:t xml:space="preserve"> debugging </w:t>
       </w:r>
       <w:proofErr w:type="spellStart"/>
       <w:r>
+        <w:rPr>
+          <w:rFonts w:ascii="Times New Roman" w:hAnsi="Times New Roman" w:cs="Times New Roman"/>
+        </w:rPr>
         <w:t>fungsi</w:t>
       </w:r>
       <w:proofErr w:type="spellEnd"/>
       <w:r>
+        <w:rPr>
+          <w:rFonts w:ascii="Times New Roman" w:hAnsi="Times New Roman" w:cs="Times New Roman"/>
+        </w:rPr>
         <w:t xml:space="preserve"> di VS Code?</w:t>
       </w:r>
     </w:p>
     <w:p>
-      <w:proofErr w:type="spellStart"/>
-      <w:r>
+      <w:pPr>
+        <w:rPr>
+          <w:rFonts w:ascii="Times New Roman" w:hAnsi="Times New Roman" w:cs="Times New Roman"/>
+        </w:rPr>
+      </w:pPr>
+      <w:proofErr w:type="spellStart"/>
+      <w:r>
+        <w:rPr>
+          <w:rFonts w:ascii="Times New Roman" w:hAnsi="Times New Roman" w:cs="Times New Roman"/>
+        </w:rPr>
         <w:t>Jawaban</w:t>
       </w:r>
       <w:proofErr w:type="spellEnd"/>
       <w:r>
+        <w:rPr>
+          <w:rFonts w:ascii="Times New Roman" w:hAnsi="Times New Roman" w:cs="Times New Roman"/>
+        </w:rPr>
         <w:t xml:space="preserve">: Step Into </w:t>
       </w:r>
       <w:proofErr w:type="spellStart"/>
       <w:r>
+        <w:rPr>
+          <w:rFonts w:ascii="Times New Roman" w:hAnsi="Times New Roman" w:cs="Times New Roman"/>
+        </w:rPr>
         <w:t>masuk</w:t>
       </w:r>
       <w:proofErr w:type="spellEnd"/>
       <w:r>
-        <w:t xml:space="preserve"> </w:t>
-      </w:r>
-      <w:proofErr w:type="spellStart"/>
-      <w:r>
+        <w:rPr>
+          <w:rFonts w:ascii="Times New Roman" w:hAnsi="Times New Roman" w:cs="Times New Roman"/>
+        </w:rPr>
+        <w:t xml:space="preserve"> </w:t>
+      </w:r>
+      <w:proofErr w:type="spellStart"/>
+      <w:r>
+        <w:rPr>
+          <w:rFonts w:ascii="Times New Roman" w:hAnsi="Times New Roman" w:cs="Times New Roman"/>
+        </w:rPr>
         <w:t>ke</w:t>
       </w:r>
       <w:proofErr w:type="spellEnd"/>
       <w:r>
-        <w:t xml:space="preserve"> </w:t>
-      </w:r>
-      <w:proofErr w:type="spellStart"/>
-      <w:r>
+        <w:rPr>
+          <w:rFonts w:ascii="Times New Roman" w:hAnsi="Times New Roman" w:cs="Times New Roman"/>
+        </w:rPr>
+        <w:t xml:space="preserve"> </w:t>
+      </w:r>
+      <w:proofErr w:type="spellStart"/>
+      <w:r>
+        <w:rPr>
+          <w:rFonts w:ascii="Times New Roman" w:hAnsi="Times New Roman" w:cs="Times New Roman"/>
+        </w:rPr>
         <w:t>dalam</w:t>
       </w:r>
       <w:proofErr w:type="spellEnd"/>
       <w:r>
+        <w:rPr>
+          <w:rFonts w:ascii="Times New Roman" w:hAnsi="Times New Roman" w:cs="Times New Roman"/>
+        </w:rPr>
         <w:t xml:space="preserve"> baris </w:t>
       </w:r>
       <w:proofErr w:type="spellStart"/>
       <w:r>
+        <w:rPr>
+          <w:rFonts w:ascii="Times New Roman" w:hAnsi="Times New Roman" w:cs="Times New Roman"/>
+        </w:rPr>
         <w:t>kode</w:t>
       </w:r>
       <w:proofErr w:type="spellEnd"/>
       <w:r>
-        <w:t xml:space="preserve"> </w:t>
-      </w:r>
-      <w:proofErr w:type="spellStart"/>
-      <w:r>
+        <w:rPr>
+          <w:rFonts w:ascii="Times New Roman" w:hAnsi="Times New Roman" w:cs="Times New Roman"/>
+        </w:rPr>
+        <w:t xml:space="preserve"> </w:t>
+      </w:r>
+      <w:proofErr w:type="spellStart"/>
+      <w:r>
+        <w:rPr>
+          <w:rFonts w:ascii="Times New Roman" w:hAnsi="Times New Roman" w:cs="Times New Roman"/>
+        </w:rPr>
         <w:t>fungsi</w:t>
       </w:r>
       <w:proofErr w:type="spellEnd"/>
       <w:r>
+        <w:rPr>
+          <w:rFonts w:ascii="Times New Roman" w:hAnsi="Times New Roman" w:cs="Times New Roman"/>
+        </w:rPr>
         <w:t xml:space="preserve">, </w:t>
       </w:r>
       <w:proofErr w:type="spellStart"/>
       <w:r>
+        <w:rPr>
+          <w:rFonts w:ascii="Times New Roman" w:hAnsi="Times New Roman" w:cs="Times New Roman"/>
+        </w:rPr>
         <w:t>sedangkan</w:t>
       </w:r>
       <w:proofErr w:type="spellEnd"/>
       <w:r>
+        <w:rPr>
+          <w:rFonts w:ascii="Times New Roman" w:hAnsi="Times New Roman" w:cs="Times New Roman"/>
+        </w:rPr>
         <w:t xml:space="preserve"> Step Over </w:t>
       </w:r>
       <w:proofErr w:type="spellStart"/>
       <w:r>
+        <w:rPr>
+          <w:rFonts w:ascii="Times New Roman" w:hAnsi="Times New Roman" w:cs="Times New Roman"/>
+        </w:rPr>
         <w:t>langsung</w:t>
       </w:r>
       <w:proofErr w:type="spellEnd"/>
       <w:r>
-        <w:t xml:space="preserve"> </w:t>
-      </w:r>
-      <w:proofErr w:type="spellStart"/>
-      <w:r>
+        <w:rPr>
+          <w:rFonts w:ascii="Times New Roman" w:hAnsi="Times New Roman" w:cs="Times New Roman"/>
+        </w:rPr>
+        <w:t xml:space="preserve"> </w:t>
+      </w:r>
+      <w:proofErr w:type="spellStart"/>
+      <w:r>
+        <w:rPr>
+          <w:rFonts w:ascii="Times New Roman" w:hAnsi="Times New Roman" w:cs="Times New Roman"/>
+        </w:rPr>
         <w:t>menjalankan</w:t>
       </w:r>
       <w:proofErr w:type="spellEnd"/>
       <w:r>
-        <w:t xml:space="preserve"> </w:t>
-      </w:r>
-      <w:proofErr w:type="spellStart"/>
-      <w:r>
+        <w:rPr>
+          <w:rFonts w:ascii="Times New Roman" w:hAnsi="Times New Roman" w:cs="Times New Roman"/>
+        </w:rPr>
+        <w:t xml:space="preserve"> </w:t>
+      </w:r>
+      <w:proofErr w:type="spellStart"/>
+      <w:r>
+        <w:rPr>
+          <w:rFonts w:ascii="Times New Roman" w:hAnsi="Times New Roman" w:cs="Times New Roman"/>
+        </w:rPr>
         <w:t>fungsi</w:t>
       </w:r>
       <w:proofErr w:type="spellEnd"/>
       <w:r>
-        <w:t xml:space="preserve"> </w:t>
-      </w:r>
-      <w:proofErr w:type="spellStart"/>
-      <w:r>
+        <w:rPr>
+          <w:rFonts w:ascii="Times New Roman" w:hAnsi="Times New Roman" w:cs="Times New Roman"/>
+        </w:rPr>
+        <w:t xml:space="preserve"> </w:t>
+      </w:r>
+      <w:proofErr w:type="spellStart"/>
+      <w:r>
+        <w:rPr>
+          <w:rFonts w:ascii="Times New Roman" w:hAnsi="Times New Roman" w:cs="Times New Roman"/>
+        </w:rPr>
         <w:t>tanpa</w:t>
       </w:r>
       <w:proofErr w:type="spellEnd"/>
       <w:r>
-        <w:t xml:space="preserve"> </w:t>
-      </w:r>
-      <w:proofErr w:type="spellStart"/>
-      <w:r>
+        <w:rPr>
+          <w:rFonts w:ascii="Times New Roman" w:hAnsi="Times New Roman" w:cs="Times New Roman"/>
+        </w:rPr>
+        <w:t xml:space="preserve"> </w:t>
+      </w:r>
+      <w:proofErr w:type="spellStart"/>
+      <w:r>
+        <w:rPr>
+          <w:rFonts w:ascii="Times New Roman" w:hAnsi="Times New Roman" w:cs="Times New Roman"/>
+        </w:rPr>
         <w:t>masuk</w:t>
       </w:r>
       <w:proofErr w:type="spellEnd"/>
       <w:r>
-        <w:t xml:space="preserve"> </w:t>
-      </w:r>
-      <w:proofErr w:type="spellStart"/>
-      <w:r>
+        <w:rPr>
+          <w:rFonts w:ascii="Times New Roman" w:hAnsi="Times New Roman" w:cs="Times New Roman"/>
+        </w:rPr>
+        <w:t xml:space="preserve"> </w:t>
+      </w:r>
+      <w:proofErr w:type="spellStart"/>
+      <w:r>
+        <w:rPr>
+          <w:rFonts w:ascii="Times New Roman" w:hAnsi="Times New Roman" w:cs="Times New Roman"/>
+        </w:rPr>
         <w:t>ke</w:t>
       </w:r>
       <w:proofErr w:type="spellEnd"/>
       <w:r>
-        <w:t xml:space="preserve"> </w:t>
-      </w:r>
-      <w:proofErr w:type="spellStart"/>
-      <w:r>
+        <w:rPr>
+          <w:rFonts w:ascii="Times New Roman" w:hAnsi="Times New Roman" w:cs="Times New Roman"/>
+        </w:rPr>
+        <w:t xml:space="preserve"> </w:t>
+      </w:r>
+      <w:proofErr w:type="spellStart"/>
+      <w:r>
+        <w:rPr>
+          <w:rFonts w:ascii="Times New Roman" w:hAnsi="Times New Roman" w:cs="Times New Roman"/>
+        </w:rPr>
         <w:t>dalamnya</w:t>
       </w:r>
       <w:proofErr w:type="spellEnd"/>
       <w:r>
+        <w:rPr>
+          <w:rFonts w:ascii="Times New Roman" w:hAnsi="Times New Roman" w:cs="Times New Roman"/>
+        </w:rPr>
         <w:t>.</w:t>
       </w:r>
     </w:p>
     <w:p>
-      <w:r>
+      <w:pPr>
+        <w:rPr>
+          <w:rFonts w:ascii="Times New Roman" w:hAnsi="Times New Roman" w:cs="Times New Roman"/>
+        </w:rPr>
+      </w:pPr>
+      <w:r>
+        <w:rPr>
+          <w:rFonts w:ascii="Times New Roman" w:hAnsi="Times New Roman" w:cs="Times New Roman"/>
+        </w:rPr>
         <w:t xml:space="preserve">9. </w:t>
       </w:r>
       <w:proofErr w:type="spellStart"/>
       <w:r>
+        <w:rPr>
+          <w:rFonts w:ascii="Times New Roman" w:hAnsi="Times New Roman" w:cs="Times New Roman"/>
+        </w:rPr>
         <w:t>Mengapa</w:t>
       </w:r>
       <w:proofErr w:type="spellEnd"/>
       <w:r>
-        <w:t xml:space="preserve"> </w:t>
-      </w:r>
-      <w:proofErr w:type="spellStart"/>
-      <w:r>
+        <w:rPr>
+          <w:rFonts w:ascii="Times New Roman" w:hAnsi="Times New Roman" w:cs="Times New Roman"/>
+        </w:rPr>
+        <w:t xml:space="preserve"> </w:t>
+      </w:r>
+      <w:proofErr w:type="spellStart"/>
+      <w:r>
+        <w:rPr>
+          <w:rFonts w:ascii="Times New Roman" w:hAnsi="Times New Roman" w:cs="Times New Roman"/>
+        </w:rPr>
         <w:t>modularisasi</w:t>
       </w:r>
       <w:proofErr w:type="spellEnd"/>
       <w:r>
-        <w:t xml:space="preserve"> </w:t>
-      </w:r>
-      <w:proofErr w:type="spellStart"/>
-      <w:r>
+        <w:rPr>
+          <w:rFonts w:ascii="Times New Roman" w:hAnsi="Times New Roman" w:cs="Times New Roman"/>
+        </w:rPr>
+        <w:t xml:space="preserve"> </w:t>
+      </w:r>
+      <w:proofErr w:type="spellStart"/>
+      <w:r>
+        <w:rPr>
+          <w:rFonts w:ascii="Times New Roman" w:hAnsi="Times New Roman" w:cs="Times New Roman"/>
+        </w:rPr>
         <w:t>membantu</w:t>
       </w:r>
       <w:proofErr w:type="spellEnd"/>
       <w:r>
-        <w:t xml:space="preserve"> </w:t>
-      </w:r>
-      <w:proofErr w:type="spellStart"/>
-      <w:r>
+        <w:rPr>
+          <w:rFonts w:ascii="Times New Roman" w:hAnsi="Times New Roman" w:cs="Times New Roman"/>
+        </w:rPr>
+        <w:t xml:space="preserve"> </w:t>
+      </w:r>
+      <w:proofErr w:type="spellStart"/>
+      <w:r>
+        <w:rPr>
+          <w:rFonts w:ascii="Times New Roman" w:hAnsi="Times New Roman" w:cs="Times New Roman"/>
+        </w:rPr>
         <w:t>pengujian</w:t>
       </w:r>
       <w:proofErr w:type="spellEnd"/>
       <w:r>
+        <w:rPr>
+          <w:rFonts w:ascii="Times New Roman" w:hAnsi="Times New Roman" w:cs="Times New Roman"/>
+        </w:rPr>
         <w:t xml:space="preserve"> program?</w:t>
       </w:r>
     </w:p>
     <w:p>
-      <w:proofErr w:type="spellStart"/>
-      <w:r>
+      <w:pPr>
+        <w:rPr>
+          <w:rFonts w:ascii="Times New Roman" w:hAnsi="Times New Roman" w:cs="Times New Roman"/>
+        </w:rPr>
+      </w:pPr>
+      <w:proofErr w:type="spellStart"/>
+      <w:r>
+        <w:rPr>
+          <w:rFonts w:ascii="Times New Roman" w:hAnsi="Times New Roman" w:cs="Times New Roman"/>
+        </w:rPr>
         <w:t>Jawaban</w:t>
       </w:r>
       <w:proofErr w:type="spellEnd"/>
       <w:r>
+        <w:rPr>
+          <w:rFonts w:ascii="Times New Roman" w:hAnsi="Times New Roman" w:cs="Times New Roman"/>
+        </w:rPr>
         <w:t xml:space="preserve">: Karena program </w:t>
       </w:r>
       <w:proofErr w:type="spellStart"/>
       <w:r>
+        <w:rPr>
+          <w:rFonts w:ascii="Times New Roman" w:hAnsi="Times New Roman" w:cs="Times New Roman"/>
+        </w:rPr>
         <w:t>dipecah</w:t>
       </w:r>
       <w:proofErr w:type="spellEnd"/>
       <w:r>
-        <w:t xml:space="preserve"> </w:t>
-      </w:r>
-      <w:proofErr w:type="spellStart"/>
-      <w:r>
+        <w:rPr>
+          <w:rFonts w:ascii="Times New Roman" w:hAnsi="Times New Roman" w:cs="Times New Roman"/>
+        </w:rPr>
+        <w:t xml:space="preserve"> </w:t>
+      </w:r>
+      <w:proofErr w:type="spellStart"/>
+      <w:r>
+        <w:rPr>
+          <w:rFonts w:ascii="Times New Roman" w:hAnsi="Times New Roman" w:cs="Times New Roman"/>
+        </w:rPr>
         <w:t>menjadi</w:t>
       </w:r>
       <w:proofErr w:type="spellEnd"/>
       <w:r>
-        <w:t xml:space="preserve"> </w:t>
-      </w:r>
-      <w:proofErr w:type="spellStart"/>
-      <w:r>
+        <w:rPr>
+          <w:rFonts w:ascii="Times New Roman" w:hAnsi="Times New Roman" w:cs="Times New Roman"/>
+        </w:rPr>
+        <w:t xml:space="preserve"> </w:t>
+      </w:r>
+      <w:proofErr w:type="spellStart"/>
+      <w:r>
+        <w:rPr>
+          <w:rFonts w:ascii="Times New Roman" w:hAnsi="Times New Roman" w:cs="Times New Roman"/>
+        </w:rPr>
         <w:t>bagian</w:t>
       </w:r>
       <w:proofErr w:type="spellEnd"/>
       <w:r>
-        <w:t xml:space="preserve"> </w:t>
-      </w:r>
-      <w:proofErr w:type="spellStart"/>
-      <w:r>
+        <w:rPr>
+          <w:rFonts w:ascii="Times New Roman" w:hAnsi="Times New Roman" w:cs="Times New Roman"/>
+        </w:rPr>
+        <w:t xml:space="preserve"> </w:t>
+      </w:r>
+      <w:proofErr w:type="spellStart"/>
+      <w:r>
+        <w:rPr>
+          <w:rFonts w:ascii="Times New Roman" w:hAnsi="Times New Roman" w:cs="Times New Roman"/>
+        </w:rPr>
         <w:t>kecil</w:t>
       </w:r>
       <w:proofErr w:type="spellEnd"/>
       <w:r>
+        <w:rPr>
+          <w:rFonts w:ascii="Times New Roman" w:hAnsi="Times New Roman" w:cs="Times New Roman"/>
+        </w:rPr>
         <w:t xml:space="preserve">, </w:t>
       </w:r>
       <w:proofErr w:type="spellStart"/>
       <w:r>
+        <w:rPr>
+          <w:rFonts w:ascii="Times New Roman" w:hAnsi="Times New Roman" w:cs="Times New Roman"/>
+        </w:rPr>
         <w:t>sehingga</w:t>
       </w:r>
       <w:proofErr w:type="spellEnd"/>
       <w:r>
-        <w:t xml:space="preserve"> </w:t>
-      </w:r>
-      <w:proofErr w:type="spellStart"/>
-      <w:r>
+        <w:rPr>
+          <w:rFonts w:ascii="Times New Roman" w:hAnsi="Times New Roman" w:cs="Times New Roman"/>
+        </w:rPr>
+        <w:t xml:space="preserve"> </w:t>
+      </w:r>
+      <w:proofErr w:type="spellStart"/>
+      <w:r>
+        <w:rPr>
+          <w:rFonts w:ascii="Times New Roman" w:hAnsi="Times New Roman" w:cs="Times New Roman"/>
+        </w:rPr>
         <w:t>letak</w:t>
       </w:r>
       <w:proofErr w:type="spellEnd"/>
       <w:r>
+        <w:rPr>
+          <w:rFonts w:ascii="Times New Roman" w:hAnsi="Times New Roman" w:cs="Times New Roman"/>
+        </w:rPr>
         <w:t xml:space="preserve"> error </w:t>
       </w:r>
       <w:proofErr w:type="spellStart"/>
       <w:r>
+        <w:rPr>
+          <w:rFonts w:ascii="Times New Roman" w:hAnsi="Times New Roman" w:cs="Times New Roman"/>
+        </w:rPr>
         <w:t>lebih</w:t>
       </w:r>
       <w:proofErr w:type="spellEnd"/>
       <w:r>
-        <w:t xml:space="preserve"> </w:t>
-      </w:r>
-      <w:proofErr w:type="spellStart"/>
-      <w:r>
+        <w:rPr>
+          <w:rFonts w:ascii="Times New Roman" w:hAnsi="Times New Roman" w:cs="Times New Roman"/>
+        </w:rPr>
+        <w:t xml:space="preserve"> </w:t>
+      </w:r>
+      <w:proofErr w:type="spellStart"/>
+      <w:r>
+        <w:rPr>
+          <w:rFonts w:ascii="Times New Roman" w:hAnsi="Times New Roman" w:cs="Times New Roman"/>
+        </w:rPr>
         <w:t>mudah</w:t>
       </w:r>
       <w:proofErr w:type="spellEnd"/>
       <w:r>
-        <w:t xml:space="preserve"> </w:t>
-      </w:r>
-      <w:proofErr w:type="spellStart"/>
-      <w:r>
+        <w:rPr>
+          <w:rFonts w:ascii="Times New Roman" w:hAnsi="Times New Roman" w:cs="Times New Roman"/>
+        </w:rPr>
+        <w:t xml:space="preserve"> </w:t>
+      </w:r>
+      <w:proofErr w:type="spellStart"/>
+      <w:r>
+        <w:rPr>
+          <w:rFonts w:ascii="Times New Roman" w:hAnsi="Times New Roman" w:cs="Times New Roman"/>
+        </w:rPr>
         <w:t>ditemukan</w:t>
       </w:r>
       <w:proofErr w:type="spellEnd"/>
       <w:r>
+        <w:rPr>
+          <w:rFonts w:ascii="Times New Roman" w:hAnsi="Times New Roman" w:cs="Times New Roman"/>
+        </w:rPr>
         <w:t>.</w:t>
       </w:r>
     </w:p>
     <w:p>
-      <w:r>
+      <w:pPr>
+        <w:rPr>
+          <w:rFonts w:ascii="Times New Roman" w:hAnsi="Times New Roman" w:cs="Times New Roman"/>
+        </w:rPr>
+      </w:pPr>
+      <w:r>
+        <w:rPr>
+          <w:rFonts w:ascii="Times New Roman" w:hAnsi="Times New Roman" w:cs="Times New Roman"/>
+        </w:rPr>
         <w:t xml:space="preserve">10. </w:t>
       </w:r>
       <w:proofErr w:type="spellStart"/>
       <w:r>
+        <w:rPr>
+          <w:rFonts w:ascii="Times New Roman" w:hAnsi="Times New Roman" w:cs="Times New Roman"/>
+        </w:rPr>
         <w:t>Perintah</w:t>
       </w:r>
       <w:proofErr w:type="spellEnd"/>
       <w:r>
+        <w:rPr>
+          <w:rFonts w:ascii="Times New Roman" w:hAnsi="Times New Roman" w:cs="Times New Roman"/>
+        </w:rPr>
         <w:t xml:space="preserve"> Git </w:t>
       </w:r>
       <w:proofErr w:type="spellStart"/>
       <w:r>
+        <w:rPr>
+          <w:rFonts w:ascii="Times New Roman" w:hAnsi="Times New Roman" w:cs="Times New Roman"/>
+        </w:rPr>
         <w:t>apa</w:t>
       </w:r>
       <w:proofErr w:type="spellEnd"/>
       <w:r>
+        <w:rPr>
+          <w:rFonts w:ascii="Times New Roman" w:hAnsi="Times New Roman" w:cs="Times New Roman"/>
+        </w:rPr>
         <w:t xml:space="preserve"> yang </w:t>
       </w:r>
       <w:proofErr w:type="spellStart"/>
       <w:r>
+        <w:rPr>
+          <w:rFonts w:ascii="Times New Roman" w:hAnsi="Times New Roman" w:cs="Times New Roman"/>
+        </w:rPr>
         <w:t>mengirim</w:t>
       </w:r>
       <w:proofErr w:type="spellEnd"/>
       <w:r>
+        <w:rPr>
+          <w:rFonts w:ascii="Times New Roman" w:hAnsi="Times New Roman" w:cs="Times New Roman"/>
+        </w:rPr>
         <w:t xml:space="preserve"> commit </w:t>
       </w:r>
       <w:proofErr w:type="spellStart"/>
       <w:r>
+        <w:rPr>
+          <w:rFonts w:ascii="Times New Roman" w:hAnsi="Times New Roman" w:cs="Times New Roman"/>
+        </w:rPr>
         <w:t>lokal</w:t>
       </w:r>
       <w:proofErr w:type="spellEnd"/>
       <w:r>
-        <w:t xml:space="preserve"> </w:t>
-      </w:r>
-      <w:proofErr w:type="spellStart"/>
-      <w:r>
+        <w:rPr>
+          <w:rFonts w:ascii="Times New Roman" w:hAnsi="Times New Roman" w:cs="Times New Roman"/>
+        </w:rPr>
+        <w:t xml:space="preserve"> </w:t>
+      </w:r>
+      <w:proofErr w:type="spellStart"/>
+      <w:r>
+        <w:rPr>
+          <w:rFonts w:ascii="Times New Roman" w:hAnsi="Times New Roman" w:cs="Times New Roman"/>
+        </w:rPr>
         <w:t>ke</w:t>
       </w:r>
       <w:proofErr w:type="spellEnd"/>
       <w:r>
+        <w:rPr>
+          <w:rFonts w:ascii="Times New Roman" w:hAnsi="Times New Roman" w:cs="Times New Roman"/>
+        </w:rPr>
         <w:t xml:space="preserve"> GitHub </w:t>
       </w:r>
       <w:proofErr w:type="spellStart"/>
       <w:r>
+        <w:rPr>
+          <w:rFonts w:ascii="Times New Roman" w:hAnsi="Times New Roman" w:cs="Times New Roman"/>
+        </w:rPr>
         <w:t>setelah</w:t>
       </w:r>
       <w:proofErr w:type="spellEnd"/>
       <w:r>
+        <w:rPr>
+          <w:rFonts w:ascii="Times New Roman" w:hAnsi="Times New Roman" w:cs="Times New Roman"/>
+        </w:rPr>
         <w:t xml:space="preserve"> remote </w:t>
       </w:r>
       <w:proofErr w:type="spellStart"/>
       <w:r>
+        <w:rPr>
+          <w:rFonts w:ascii="Times New Roman" w:hAnsi="Times New Roman" w:cs="Times New Roman"/>
+        </w:rPr>
         <w:t>sudah</w:t>
       </w:r>
       <w:proofErr w:type="spellEnd"/>
       <w:r>
-        <w:t xml:space="preserve"> </w:t>
-      </w:r>
-      <w:proofErr w:type="spellStart"/>
-      <w:r>
+        <w:rPr>
+          <w:rFonts w:ascii="Times New Roman" w:hAnsi="Times New Roman" w:cs="Times New Roman"/>
+        </w:rPr>
+        <w:t xml:space="preserve"> </w:t>
+      </w:r>
+      <w:proofErr w:type="spellStart"/>
+      <w:r>
+        <w:rPr>
+          <w:rFonts w:ascii="Times New Roman" w:hAnsi="Times New Roman" w:cs="Times New Roman"/>
+        </w:rPr>
         <w:t>terhubung</w:t>
       </w:r>
       <w:proofErr w:type="spellEnd"/>
       <w:r>
+        <w:rPr>
+          <w:rFonts w:ascii="Times New Roman" w:hAnsi="Times New Roman" w:cs="Times New Roman"/>
+        </w:rPr>
         <w:t>?</w:t>
       </w:r>
     </w:p>
     <w:p>
-      <w:proofErr w:type="spellStart"/>
-      <w:r>
+      <w:pPr>
+        <w:rPr>
+          <w:rFonts w:ascii="Times New Roman" w:hAnsi="Times New Roman" w:cs="Times New Roman"/>
+        </w:rPr>
+      </w:pPr>
+      <w:proofErr w:type="spellStart"/>
+      <w:r>
+        <w:rPr>
+          <w:rFonts w:ascii="Times New Roman" w:hAnsi="Times New Roman" w:cs="Times New Roman"/>
+        </w:rPr>
         <w:t>Jawaban</w:t>
       </w:r>
       <w:proofErr w:type="spellEnd"/>
       <w:r>
+        <w:rPr>
+          <w:rFonts w:ascii="Times New Roman" w:hAnsi="Times New Roman" w:cs="Times New Roman"/>
+        </w:rPr>
         <w:t>: git push.</w:t>
       </w:r>
     </w:p>

</xml_diff>